<commit_message>
Drop Monte Carlo; deterministic real estimates only; recast abstract to fit the C40/JCCPE call
- Remove the Monte Carlo throughout (abstract, methods, Table 8, leverage,
  conclusion). Headline is now the conservative real-data build-up: realized
  ~USD 1M/yr + ex-ante USD 1.8-5.6M/yr (central ~USD 3M), before leverage.
  Table 8 restored to deterministic Low/Base/High with value-capture subtotal.
- Rewrite the abstract for a tight fit with the call 'Financing Sustainable
  Cities': municipalities lacking financial tools/autonomy/access; closing the
  gap between climate ambition and financial reality with equity, human
  wellbeing and environmental limits at the centre; an underexploited derisking
  mechanism; Majority World; replicable. Opens on Clifton et al. (2025).
  Abstract 250 words; Lessons for Policymakers 250 words.
- Clifton et al. reference marked advance online publication (title to confirm).
</commit_message>
<xml_diff>
--- a/paper/LVC_Climate_Adaptation_Paper_FINAL_JCCPE.docx
+++ b/paper/LVC_Climate_Adaptation_Paper_FINAL_JCCPE.docx
@@ -150,7 +150,7 @@
         <w:spacing w:after="120" w:line="276" w:lineRule="auto"/>
       </w:pPr>
       <w:r>
-        <w:t>Cities in the Majority World face an adaptation-finance gap that international public flows cover by less than a tenth, yet land value capture (LVC) has developed largely apart from climate finance (Dunning and Lord, 2020), and its few climate applications cluster in coastal-flooding settings. We ask how a coordinated, multi-instrument LVC system, ring-fenced in a municipal Trust Fund, can mobilise predictable, equity-sensitive capital for adaptation in a slow-onset, water-scarce city under binding macroeconomic constraints. The case is Luján de Cuyo (Mendoza, Argentina; about 175,000 residents, 46% intercensal growth) in a semi-arid irrigated oasis, now legislating six instruments: betterment contributions, capture of rezoning gains, tradable building rights, transfer of development rights, an idle-land surcharge, and strategic exemptions. Revenues flow through a Fideicomiso designed to leverage the ring-fenced stream into green bonds and multilateral climate finance (CAF, IDB, GCF), with allocation governed by a Sustainable Urbanism Priority Index of six dimensions and some two dozen indicators. We foreground incidence—who pays, who benefits—and show how the disbursement rule directs investment to districts with lower baseline access to green space, water, and services. Unusually, two instruments already operate: a surcharge on 5,315 idle parcels and a water-and-sewer charge whose real collections rose elevenfold in 2021–2025. Ex ante, at 2030 maturity, the package yields an estimated USD 8.2 million per year (Monte Carlo, 10,000 draws; 90% CI 4.3–14.3 million), before leverage. The result offers a tractable, replicable template for water-stressed Majority-World cities.</w:t>
+        <w:t>Municipalities are now on the front line of climate action, yet they routinely lack the financial tools, autonomy, and access to capital to deliver it—and the finance that does flow favours cities already equipped to compete for it, not those most exposed (Clifton et al., 2025). This article asks how a city can close the gap between climate ambition and financial reality from its own tax base, while keeping equity, human wellbeing, and environmental limits at the centre. Its answer is an underexploited derisking mechanism: a six-instrument land value capture (LVC) package, ring-fenced in a municipal Trust Fund (Fideicomiso) and allocated by a district-level Sustainable Urbanism Priority Index. LVC has developed apart from climate finance (Dunning and Lord, 2020), and its climate applications cluster in coastal-flooding contexts; this case is the opposite—Luján de Cuyo (Mendoza, Argentina; ~175,000 residents, 46% intercensal growth), a water-stressed Majority-World city where converting vineyards to housing yields windfalls while draining the aquifer that gives the land its value. The instruments tax that conversion and route the proceeds—through a vehicle multilateral lenders (CAF, IDB, GCF) and bond markets can underwrite—to the districts with least green space, water, and services; incidence—who pays, who benefits—is a design variable. Two instruments already operate: a surcharge on 5,315 idle lots and a water-and-sewer charge up elevenfold in real terms (2021–2025). The full package, calibrated to the 2026 works programme and buildability code, could raise USD 1.8–5.6 million a year (≈ USD 3 million central), before leverage—a replicable template for water-stressed cities.</w:t>
       </w:r>
     </w:p>
     <w:p>
@@ -297,7 +297,7 @@
         <w:spacing w:after="120" w:line="276" w:lineRule="auto"/>
       </w:pPr>
       <w:r>
-        <w:t>Our answers rest on real municipal data, and we are deliberate about the line between evidence and estimate. We report what two operational instruments actually collect; we size the designed instruments against the city’s genuine 2026 works programme, its land-value and built-value maps, and its new buildability schedule, and we propagate the remaining uncertainty through a Monte Carlo simulation; and we test whether planned investment goes where the priority index says it is needed. Section 2 places the argument in the literatures on land value capture, adaptation finance, and water and land markets. Section 3 introduces the case and the data. Section 4 sets out the six instruments. Section 5 develops the trust-fund architecture and its role as a matching-funds and repayment vehicle. Section 6 describes the priority index. Section 7 presents the revenue, incidence, and financing-gap estimates. Section 8 turns to transferability, and Section 9 concludes.</w:t>
+        <w:t>Our answers rest on real municipal data, and we are deliberate about the line between evidence and estimate. We report what two operational instruments actually collect; we size the designed instruments against the city’s genuine 2026 works programme, its land-value and built-value maps, and its new buildability schedule, reporting conservative, baseline, and optimistic scenarios; and we test whether planned investment goes where the priority index says it is needed. Section 2 places the argument in the literatures on land value capture, adaptation finance, and water and land markets. Section 3 introduces the case and the data. Section 4 sets out the six instruments. Section 5 develops the trust-fund architecture and its role as a matching-funds and repayment vehicle. Section 6 describes the priority index. Section 7 presents the revenue, incidence, and financing-gap estimates. Section 8 turns to transferability, and Section 9 concludes.</w:t>
       </w:r>
     </w:p>
     <w:p>
@@ -409,7 +409,7 @@
         <w:spacing w:after="120" w:line="276" w:lineRule="auto"/>
       </w:pPr>
       <w:r>
-        <w:t>This is a single-case study built from primary municipal material gathered between 2018 and 2026: ordinances and the draft instruments code; the 2026 public-works programme; the 2026 tax roll and the vacant-land padrón; collection records for the operational charges; the municipal land-value, built-value, and fiscal-assessment maps; the draft COS 2026 buildability schedule and a comparative zoning analysis; and the priority-index methodology with its first district-level results. We are explicit throughout about the status of every figure. Revenue from the two operational instruments is realized and drawn from municipal records; estimates for the designed instruments apply the ordinance’s own formulas to real parameters—works costs, land and built values, buildability—rather than to assumed transaction volumes, and the residual uncertainty is propagated through a Monte Carlo simulation. All peso figures are expressed in inflation-adjusted, exchange-rate-converted US dollars; the Tax Unit is set at its 2026 value (ARS 235) and conversions use the 2025 average rate (ARS 1,244.17/USD). Where a parameter is genuinely unobserved—above all the future take-up of instruments not yet in force—we say so and bound it.</w:t>
+        <w:t>This is a single-case study built from primary municipal material gathered between 2018 and 2026: ordinances and the draft instruments code; the 2026 public-works programme; the 2026 tax roll and the vacant-land padrón; collection records for the operational charges; the municipal land-value, built-value, and fiscal-assessment maps; the draft COS 2026 buildability schedule and a comparative zoning analysis; and the priority-index methodology with its first district-level results. We are explicit throughout about the status of every figure. Revenue from the two operational instruments is realized and drawn from municipal records; estimates for the designed instruments apply the ordinance’s own formulas to real parameters—works costs, land and built values, buildability—rather than to assumed transaction volumes, and reported as conservative-to-optimistic scenarios. All peso figures are expressed in inflation-adjusted, exchange-rate-converted US dollars; the Tax Unit is set at its 2026 value (ARS 235) and conversions use the 2025 average rate (ARS 1,244.17/USD). Where a parameter is genuinely unobserved—above all the future take-up of instruments not yet in force—we say so and bound it.</w:t>
       </w:r>
     </w:p>
     <w:p>
@@ -1100,7 +1100,7 @@
         <w:spacing w:after="120" w:line="276" w:lineRule="auto"/>
       </w:pPr>
       <w:r>
-        <w:t>On repayment, the same flows service debt. The water-and-sewer series—elevenfold real growth over 2021–2025 (Section 7.2)—is exactly the kind of demonstrated, ring-fenced cash flow against which a debt-service-coverage ratio can be computed and a bond rated. Pledging the fund’s flows through the fideicomiso rather than the general budget raises the effective seniority of repayment and lowers the risk premium. As the package matures, a green-bond issuance of three to four times annual revenue scales from roughly USD 9–12 million in the near term toward USD 25–33 million at the maturity estimate of Section 7—enough to finance the bulk of the deficits the priority index identifies.</w:t>
+        <w:t>On repayment, the same flows service debt. The water-and-sewer series—elevenfold real growth over 2021–2025 (Section 7.2)—is exactly the kind of demonstrated, ring-fenced cash flow against which a debt-service-coverage ratio can be computed and a bond rated. Pledging the fund’s flows through the fideicomiso rather than the general budget raises the effective seniority of repayment and lowers the risk premium. A green-bond issuance of three to four times annual revenue—on the order of USD 9–12 million at the baseline, and more as the package matures—is serviceable from the dedicated streams and would finance a first tranche of the deficits the priority index identifies.</w:t>
       </w:r>
     </w:p>
     <w:p>
@@ -1531,7 +1531,7 @@
         <w:spacing w:after="120" w:line="276" w:lineRule="auto"/>
       </w:pPr>
       <w:r>
-        <w:t>We report revenue on two footings and never blur them. Realized revenue is what the two operational instruments actually collect—the water-and-sewer charge (records 2021–2025) and the vacant-land surcharge (the 2026 tax roll)—expressed in inflation- and exchange-rate-adjusted dollars. Ex-ante potential covers the designed instruments—betterment, differential rent capture, and development-rights sales—through two complementary estimates. The first is a transparent deterministic build-up, instrument by instrument, from the real parameters that follow: the 2026 works programme, the COS 2026 buildability schedule, and the land- and built-value maps. The second is a Monte Carlo simulation (10,000 draws) that propagates the residual uncertainty—in annual take-up, in unit prices calibrated to May 2026 market values and the 2026 cadastral formulas, and in capitalisation elasticities drawn from the Latin American literature. The deterministic build-up gives a conservative near-term floor; the Monte Carlo gives a central estimate at 2030 maturity with a 90 percent confidence interval. The Tax Unit is at its 2026 value (ARS 235) and conversions use ARS 1,244.17/USD.</w:t>
+        <w:t>We report revenue on two footings and never blur them. Realized revenue is what the two operational instruments actually collect—the water-and-sewer charge (records 2021–2025) and the vacant-land surcharge (the 2026 tax roll)—expressed in inflation- and exchange-rate-adjusted dollars. Ex-ante potential covers the designed instruments—betterment, differential rent capture, and development-rights sales—through a transparent deterministic build-up, instrument by instrument, from the real parameters that follow: the 2026 works programme, the COS 2026 buildability schedule, and the land- and built-value maps. Because no transactions exist for these instruments yet, the point estimates are illustrative; we report conservative, baseline, and optimistic scenarios and are candid about the one genuinely unobserved parameter—the future annual take-up of instruments not yet in force. The Tax Unit is at its 2026 value (ARS 235) and conversions use ARS 1,244.17/USD.</w:t>
       </w:r>
     </w:p>
     <w:p>
@@ -3591,7 +3591,7 @@
         <w:spacing w:after="120" w:line="276" w:lineRule="auto"/>
       </w:pPr>
       <w:r>
-        <w:t>What gives these instruments their base is the city’s new buildability code. The draft COS 2026 replaces a single height limit with two lines: a base of 10 metres (13 in ZCM6), buildable without instruments, and a maximum of 36 metres reached only by purchasing additional building rights (Suelo Creado) or through rent capture—about 8.7 extra floors. Across the seven affected zones (4,491 hectares, with floor-area coverage of 75–90 percent), this opens a ceiling near 295 million m² of additional buildable area (Table 7), a theoretical maximum that assumes full take-up. Revenue therefore depends on annual absorption, which the deterministic build-up sets conservatively at 20,000–80,000 m²/yr and the Monte Carlo allows to grow toward maturity.</w:t>
+        <w:t>What gives these instruments their base is the city’s new buildability code. The draft COS 2026 replaces a single height limit with two lines: a base of 10 metres (13 in ZCM6), buildable without instruments, and a maximum of 36 metres reached only by purchasing additional building rights (Suelo Creado) or through rent capture—about 8.7 extra floors. Across the seven affected zones (4,491 hectares, with floor-area coverage of 75–90 percent), this opens a ceiling near 295 million m² of additional buildable area (Table 7), a theoretical maximum that assumes full take-up. Revenue therefore depends on annual absorption, which we set conservatively at 20,000–80,000 m²/yr across the Low–High scenarios—under 0.03 percent of the ceiling even at the high end, so the development-rights base will not bind for decades.</w:t>
       </w:r>
     </w:p>
     <w:tbl>
@@ -4278,7 +4278,7 @@
         <w:spacing w:after="120" w:line="276" w:lineRule="auto"/>
       </w:pPr>
       <w:r>
-        <w:t>Valuing the modelled take-up closes the estimate. Floor space sells for roughly USD 300–1,200/m² in these zones (built-value map), of which the instruments capture a small fraction—Suelo Creado at about 50–250 UT/m² and rent capture at 30–180 UT/m². Under conservative near-term take-up the deterministic build-up centres near USD 3 million a year (Table 8: USD 1.8 million Low to USD 5.6 million High), with the two operational instruments already collecting about USD 1 million today. Propagating price, elasticity, and take-up uncertainty to 2030 maturity, the Monte Carlo places the package’s annual potential at USD 8.2 million (90% CI USD 4.3–14.3 million), before leverage. The gap between the conservative build-up and the Monte Carlo central reflects fuller absorption of the 295-million-m² rights ceiling and valuation at market rather than administrative prices; the deterministic figures are best read as a near-term floor, the Monte Carlo as the matured potential.</w:t>
+        <w:t>Valuing this take-up closes the estimate. Floor space sells for roughly USD 300–1,200/m² in these zones (built-value map), of which the instruments capture a small fraction—Suelo Creado at about 50–250 UT/m² and rent capture at 30–180 UT/m². Adding the three designed instruments to the two operational ones, the package’s combined annual potential runs from about USD 1.8 million (Low) to USD 5.6 million (High), centred near USD 3.0 million (Table 8)—of which roughly USD 1 million is already collected. These are deliberately conservative figures tied to current parameters; because the rights ceiling is so large, they are best read as a near-term floor that rises with take-up, not as a cap.</w:t>
       </w:r>
     </w:p>
     <w:tbl>
@@ -4306,7 +4306,7 @@
                 <w:b/>
                 <w:sz w:val="18"/>
               </w:rPr>
-              <w:t>Instrument / estimate</w:t>
+              <w:t>Instrument</w:t>
             </w:r>
           </w:p>
         </w:tc>
@@ -4321,7 +4321,7 @@
                 <w:b/>
                 <w:sz w:val="18"/>
               </w:rPr>
-              <w:t>Basis</w:t>
+              <w:t>Basis (real municipal data)</w:t>
             </w:r>
           </w:p>
         </w:tc>
@@ -4351,7 +4351,7 @@
                 <w:b/>
                 <w:sz w:val="18"/>
               </w:rPr>
-              <w:t>Central</w:t>
+              <w:t>Base (USD/yr)</w:t>
             </w:r>
           </w:p>
         </w:tc>
@@ -4598,7 +4598,7 @@
               <w:rPr>
                 <w:sz w:val="18"/>
               </w:rPr>
-              <w:t>Realized operational</w:t>
+              <w:t>Subtotal — value capture (ex-ante)</w:t>
             </w:r>
           </w:p>
         </w:tc>
@@ -4612,7 +4612,6 @@
               <w:rPr>
                 <w:sz w:val="18"/>
               </w:rPr>
-              <w:t>Municipal records (2025/2026)</w:t>
             </w:r>
           </w:p>
         </w:tc>
@@ -4626,7 +4625,7 @@
               <w:rPr>
                 <w:sz w:val="18"/>
               </w:rPr>
-              <w:t>0.97 M</w:t>
+              <w:t>0.85 M</w:t>
             </w:r>
           </w:p>
         </w:tc>
@@ -4640,7 +4639,7 @@
               <w:rPr>
                 <w:sz w:val="18"/>
               </w:rPr>
-              <w:t>0.97 M</w:t>
+              <w:t>2.07 M</w:t>
             </w:r>
           </w:p>
         </w:tc>
@@ -4654,7 +4653,7 @@
               <w:rPr>
                 <w:sz w:val="18"/>
               </w:rPr>
-              <w:t>0.97 M</w:t>
+              <w:t>4.65 M</w:t>
             </w:r>
           </w:p>
         </w:tc>
@@ -4670,7 +4669,7 @@
               <w:rPr>
                 <w:sz w:val="18"/>
               </w:rPr>
-              <w:t>Deterministic total (near-term)</w:t>
+              <w:t>Realized operational (water/sewer + vacant land)</w:t>
             </w:r>
           </w:p>
         </w:tc>
@@ -4684,7 +4683,7 @@
               <w:rPr>
                 <w:sz w:val="18"/>
               </w:rPr>
-              <w:t>Sum of the above</w:t>
+              <w:t>Municipal records (2025/2026)</w:t>
             </w:r>
           </w:p>
         </w:tc>
@@ -4698,7 +4697,7 @@
               <w:rPr>
                 <w:sz w:val="18"/>
               </w:rPr>
-              <w:t>1.82 M</w:t>
+              <w:t>0.97 M</w:t>
             </w:r>
           </w:p>
         </w:tc>
@@ -4712,7 +4711,7 @@
               <w:rPr>
                 <w:sz w:val="18"/>
               </w:rPr>
-              <w:t>3.04 M</w:t>
+              <w:t>0.97 M</w:t>
             </w:r>
           </w:p>
         </w:tc>
@@ -4726,7 +4725,7 @@
               <w:rPr>
                 <w:sz w:val="18"/>
               </w:rPr>
-              <w:t>5.62 M</w:t>
+              <w:t>0.97 M</w:t>
             </w:r>
           </w:p>
         </w:tc>
@@ -4742,7 +4741,7 @@
               <w:rPr>
                 <w:sz w:val="18"/>
               </w:rPr>
-              <w:t>Monte Carlo total (2030 maturity)</w:t>
+              <w:t>Total annual revenue potential</w:t>
             </w:r>
           </w:p>
         </w:tc>
@@ -4756,7 +4755,6 @@
               <w:rPr>
                 <w:sz w:val="18"/>
               </w:rPr>
-              <w:t>10,000 draws; market prices + elasticities</w:t>
             </w:r>
           </w:p>
         </w:tc>
@@ -4770,7 +4768,7 @@
               <w:rPr>
                 <w:sz w:val="18"/>
               </w:rPr>
-              <w:t>4.3 M</w:t>
+              <w:t>1.82 M</w:t>
             </w:r>
           </w:p>
         </w:tc>
@@ -4784,7 +4782,7 @@
               <w:rPr>
                 <w:sz w:val="18"/>
               </w:rPr>
-              <w:t>8.2 M</w:t>
+              <w:t>3.04 M</w:t>
             </w:r>
           </w:p>
         </w:tc>
@@ -4798,7 +4796,7 @@
               <w:rPr>
                 <w:sz w:val="18"/>
               </w:rPr>
-              <w:t>14.3 M</w:t>
+              <w:t>5.62 M</w:t>
             </w:r>
           </w:p>
         </w:tc>
@@ -4813,7 +4811,7 @@
           <w:i/>
           <w:sz w:val="18"/>
         </w:rPr>
-        <w:t>Table 8: Revenue potential by instrument and method. The deterministic build-up (rows 1–5) is a conservative near-term floor under current take-up; the Monte Carlo (row 6) is the central estimate at 2030 maturity with a 90% confidence interval, before leverage. Ordinance formulas (UT 2026 = ARS 235); converted at ARS 1,244.17/USD.</w:t>
+        <w:t>Table 8: Revenue potential by instrument and scenario—a deterministic build-up from real parameters (ordinance formulas, UT 2026 = ARS 235; converted at ARS 1,244.17/USD). Ex-ante figures are illustrative and conservative, tied to current take-up; all figures are before leverage.</w:t>
       </w:r>
     </w:p>
     <w:p>
@@ -4845,7 +4843,7 @@
         <w:spacing w:after="120" w:line="276" w:lineRule="auto"/>
       </w:pPr>
       <w:r>
-        <w:t>To make the numbers concrete, take one deficit the index measures. Lifting green space from a municipal average near 6 m² per inhabitant to the index’s 10 m² target implies roughly 700,000 m² of new green space for about 175,000 residents; at an indicative USD 80/m², a one-off capital need near USD 56 million. Near-term revenue of about USD 3 million covers some 5 percent of that in a year on a pay-as-you-go basis—which is why pay-as-you-go is the wrong frame. The trust fund’s leverage (Section 5.5) is what closes the gap: a dedicated reserve to match grants, and a pledged revenue stream to secure a green bond of three to four times annual revenue—USD 9–12 million in the near term, rising toward USD 25–33 million at the Monte Carlo maturity estimate, enough to finance most of the deficit in a single issuance.</w:t>
+        <w:t>To make the numbers concrete, take one deficit the index measures. Lifting green space from a municipal average near 6 m² per inhabitant to the index’s 10 m² target implies roughly 700,000 m² of new green space for about 175,000 residents; at an indicative USD 80/m², a one-off capital need near USD 56 million. Near-term revenue of about USD 3 million covers some 5 percent of that in a year on a pay-as-you-go basis—which is why pay-as-you-go is the wrong frame. The trust fund’s leverage (Section 5.5) is what closes the gap: a dedicated reserve to match grants, and a pledged revenue stream to secure a green bond of three to four times annual revenue—about USD 9–12 million at the baseline, and more as the package matures—covering a large share of the deficit in a single issuance.</w:t>
       </w:r>
     </w:p>
     <w:p>
@@ -5776,7 +5774,7 @@
         <w:spacing w:after="120" w:line="276" w:lineRule="auto"/>
       </w:pPr>
       <w:r>
-        <w:t>The alignment between land value capture and climate adaptation has been recognised in the literature for years and implemented almost nowhere. Luján de Cuyo shows what implementation looks like in an intermediate, water-stressed, Majority-World city: six instruments that catch the increment across the development cycle; a fideicomiso that pools them into matched, repayable revenue; and a priority index that points the money toward need. The evidence is partly already in the bank—an elevenfold real rise in one operational charge, a surcharge on more than five thousand idle lots—and partly ahead of it, in instruments calibrated to a real works programme and a real buildability code whose matured potential the Monte Carlo places near USD 8 million a year before leverage.</w:t>
+        <w:t>The alignment between land value capture and climate adaptation has been recognised in the literature for years and implemented almost nowhere. Luján de Cuyo shows what implementation looks like in an intermediate, water-stressed, Majority-World city: six instruments that catch the increment across the development cycle; a fideicomiso that pools them into matched, repayable revenue; and a priority index that points the money toward need. The evidence is partly already in the bank—an elevenfold real rise in one operational charge, a surcharge on more than five thousand idle lots—and partly ahead of it, in instruments calibrated to a real works programme and a real buildability code, whose combined potential we estimate conservatively at USD 1.8–5.6 million a year (central ≈ USD 3 million), before leverage.</w:t>
       </w:r>
     </w:p>
     <w:p>
@@ -5876,7 +5874,7 @@
         <w:rPr>
           <w:sz w:val="18"/>
         </w:rPr>
-        <w:t>Clifton, J., Díaz-Fuentes, D., Fernández Gutiérrez, M., &amp; Lara Gómez, A. (2025). The green transition’s geography problem: European Investment Bank climate finance and regional vulnerability. Cambridge Journal of Regions, Economy and Society.</w:t>
+        <w:t>Clifton, J., Díaz-Fuentes, D., Fernández Gutiérrez, M., &amp; Lara Gómez, A. (2025). European Investment Bank climate finance and regional vulnerability in the just transition. Cambridge Journal of Regions, Economy and Society (advance online publication). [Exact title to be confirmed.]</w:t>
       </w:r>
     </w:p>
     <w:p>

</xml_diff>

<commit_message>
Make submission JCCPE-compliant per official author guidelines
Original Research restructured to the journal's required format:
- Headings Background / Methods / Results / Conclusion; main text 5,075 words
  (within the 5,000-7,500 limit, excl. references).
- Structured abstract (Background/Methods/Results/Conclusions, 238 words).
- Summary for Policymakers as bullets (160 words, <=200).
- Title page with running title (45 chars); Funding, Author Contributions
  (CRediT), Conflict of Interest, Data Accessibility statements; APA references;
  figure-captions list. 10 tables in order (restored provincial-works and COS
  buildability tables). Added literature, methods, robustness, incidence-caveat,
  and discussion-vs-literature paragraphs to meet length with substance.
- Policy Guidelines companion: 2,500 words (within 2,000-3,000) with an
  unstructured abstract and Summary for Policymakers added.
- Deterministic real estimates throughout (no Monte Carlo).
</commit_message>
<xml_diff>
--- a/paper/LVC_Climate_Adaptation_Paper_FINAL_JCCPE.docx
+++ b/paper/LVC_Climate_Adaptation_Paper_FINAL_JCCPE.docx
@@ -28,7 +28,7 @@
         <w:spacing w:after="120" w:line="276" w:lineRule="auto"/>
       </w:pPr>
       <w:r>
-        <w:t>Re: Abstract submission — Special Issue on “Financing Sustainable Cities: Mobilising Capital for Equitable, Resilient and Low-Carbon Urban Futures.”</w:t>
+        <w:t>Re: Original Research submission — Special Issue, “Financing Sustainable Cities: Mobilising Capital for Equitable, Resilient and Low-Carbon Urban Futures.”</w:t>
       </w:r>
     </w:p>
     <w:p>
@@ -44,7 +44,7 @@
         <w:spacing w:after="120" w:line="276" w:lineRule="auto"/>
       </w:pPr>
       <w:r>
-        <w:t>Please find attached an Original Research submission, “Financing Water-Resilient Cities through Multi-Instrument Land Value Capture: Evidence from Luján de Cuyo, Argentina.” It presents both realized revenue and ex ante estimates for a six-instrument land value capture (LVC) package channelled through a municipal Trust Fund (Fideicomiso) and governed by a Sustainable Urbanism Priority Index, currently before the Concejo Deliberante of Luján de Cuyo (Mendoza, Argentina).</w:t>
+        <w:t>Please find attached an Original Research submission, “Financing Water-Resilient Cities through Multi-Instrument Land Value Capture: Evidence from Luján de Cuyo, Argentina,” together with the required structured abstract, Summary for Policymakers, and disclosures. The paper presents both realized revenue and ex ante estimates for a six-instrument land value capture (LVC) package channelled through a municipal Trust Fund (Fideicomiso) and governed by a Sustainable Urbanism Priority Index, currently before the Concejo Deliberante of Luján de Cuyo (Mendoza, Argentina).</w:t>
       </w:r>
     </w:p>
     <w:p>
@@ -52,7 +52,7 @@
         <w:spacing w:after="120" w:line="276" w:lineRule="auto"/>
       </w:pPr>
       <w:r>
-        <w:t>The case speaks to two priorities in the call. First, it builds the point of tangency between the land value capture and climate-finance literatures that Dunning and Lord (2020) identify as missing. Second, it documents LVC outside the coastal-flooding contexts where the evidence has clustered: a Majority-World, slow-onset, water-scarcity setting under binding hydrological and macroeconomic constraints. The analysis foregrounds incidence—who pays and who benefits—and shows how the Fideicomiso’s indicator-based disbursement rule guards against regressive outcomes. Unusually for an ex ante case, two of the instruments already operate and collect revenue, which lets us anchor the projections in observed municipal data rather than assumption alone. The research forms part of a 12-month case study supported by the Lincoln Institute of Land Policy.</w:t>
+        <w:t>The case speaks to two priorities in the call. First, it builds the point of tangency between the land value capture and climate-finance literatures that Dunning and Lord (2020) identify as missing. Second, it documents LVC outside the coastal-flooding contexts where the evidence has clustered: a Majority-World, slow-onset, water-scarcity setting under binding hydrological and macroeconomic constraints. The analysis foregrounds incidence—who pays and who benefits—and shows how the Fideicomiso’s indicator-based disbursement rule guards against regressive outcomes. Unusually for an ex ante case, two of the instruments already operate and collect revenue, anchoring the projections in observed municipal data. The research forms part of a 12-month case study supported by the Lincoln Institute of Land Policy. A companion Policy Guidelines piece for municipal finance teams is available if it would strengthen the issue.</w:t>
       </w:r>
     </w:p>
     <w:p>
@@ -60,7 +60,7 @@
         <w:spacing w:after="120" w:line="276" w:lineRule="auto"/>
       </w:pPr>
       <w:r>
-        <w:t>I would welcome your guidance on fit, and would gladly develop an accompanying Policy Guidelines piece with municipal counterparts and LILP if that would strengthen the issue.</w:t>
+        <w:t>The manuscript is original, not previously published, and not under consideration elsewhere. I am the corresponding and sole author (cgoytia@utdt.edu).</w:t>
       </w:r>
     </w:p>
     <w:p>
@@ -104,6 +104,19 @@
       <w:r>
         <w:rPr>
           <w:b w:val="0"/>
+          <w:i/>
+          <w:sz w:val="18"/>
+        </w:rPr>
+        <w:t>Running title: Land value capture for water-resilient cities</w:t>
+      </w:r>
+    </w:p>
+    <w:p>
+      <w:pPr>
+        <w:jc w:val="center"/>
+      </w:pPr>
+      <w:r>
+        <w:rPr>
+          <w:b w:val="0"/>
           <w:i w:val="0"/>
           <w:sz w:val="24"/>
         </w:rPr>
@@ -118,9 +131,9 @@
         <w:rPr>
           <w:b w:val="0"/>
           <w:i/>
-          <w:sz w:val="20"/>
+          <w:sz w:val="18"/>
         </w:rPr>
-        <w:t>Center for Urban and Real Estate Research (CIPUV), Universidad Torcuato Di Tella, Buenos Aires — cgoytia@utdt.edu</w:t>
+        <w:t>Center for Urban and Real Estate Research (CIPUV), Universidad Torcuato Di Tella, Av. Figueroa Alcorta 7350, Buenos Aires, Argentina</w:t>
       </w:r>
     </w:p>
     <w:p>
@@ -131,7 +144,20 @@
         <w:rPr>
           <w:b w:val="0"/>
           <w:i/>
-          <w:sz w:val="20"/>
+          <w:sz w:val="18"/>
+        </w:rPr>
+        <w:t>Corresponding author: Cynthia Goytia — cgoytia@utdt.edu</w:t>
+      </w:r>
+    </w:p>
+    <w:p>
+      <w:pPr>
+        <w:jc w:val="center"/>
+      </w:pPr>
+      <w:r>
+        <w:rPr>
+          <w:b w:val="0"/>
+          <w:i/>
+          <w:sz w:val="18"/>
         </w:rPr>
         <w:t>Article type: Original Research · Special Issue: Financing Sustainable Cities (JCCPE)</w:t>
       </w:r>
@@ -147,10 +173,58 @@
     </w:p>
     <w:p>
       <w:pPr>
-        <w:spacing w:after="120" w:line="276" w:lineRule="auto"/>
+        <w:spacing w:after="120"/>
       </w:pPr>
       <w:r>
-        <w:t>Municipalities are now on the front line of climate action, yet they routinely lack the financial tools, autonomy, and access to capital to deliver it—and the finance that does flow favours cities already equipped to compete for it, not those most exposed (Clifton et al., 2025). This article asks how a city can close the gap between climate ambition and financial reality from its own tax base, while keeping equity, human wellbeing, and environmental limits at the centre. Its answer is an underexploited derisking mechanism: a six-instrument land value capture (LVC) package, ring-fenced in a municipal Trust Fund (Fideicomiso) and allocated by a district-level Sustainable Urbanism Priority Index. LVC has developed apart from climate finance (Dunning and Lord, 2020), and its climate applications cluster in coastal-flooding contexts; this case is the opposite—Luján de Cuyo (Mendoza, Argentina; ~175,000 residents, 46% intercensal growth), a water-stressed Majority-World city where converting vineyards to housing yields windfalls while draining the aquifer that gives the land its value. The instruments tax that conversion and route the proceeds—through a vehicle multilateral lenders (CAF, IDB, GCF) and bond markets can underwrite—to the districts with least green space, water, and services; incidence—who pays, who benefits—is a design variable. Two instruments already operate: a surcharge on 5,315 idle lots and a water-and-sewer charge up elevenfold in real terms (2021–2025). The full package, calibrated to the 2026 works programme and buildability code, could raise USD 1.8–5.6 million a year (≈ USD 3 million central), before leverage—a replicable template for water-stressed cities.</w:t>
+        <w:rPr>
+          <w:b/>
+        </w:rPr>
+        <w:t xml:space="preserve">Background. </w:t>
+      </w:r>
+      <w:r>
+        <w:t>Municipalities are on the front line of climate action but lack the financial tools, autonomy, and access to capital to deliver it, and the finance that does flow favours cities already able to compete, not those most exposed (Clifton et al., 2025). Land value capture (LVC) has developed apart from climate finance (Dunning and Lord, 2020), and its climate applications cluster in coastal-flooding settings; evidence from water-scarce, Majority-World cities is scarce.</w:t>
+      </w:r>
+    </w:p>
+    <w:p>
+      <w:pPr>
+        <w:spacing w:after="120"/>
+      </w:pPr>
+      <w:r>
+        <w:rPr>
+          <w:b/>
+        </w:rPr>
+        <w:t xml:space="preserve">Methods. </w:t>
+      </w:r>
+      <w:r>
+        <w:t>We present a single-case study of Luján de Cuyo (Mendoza, Argentina; ~175,000 residents), which is legislating a coordinated six-instrument LVC package, ring-fenced in a municipal Trust Fund (Fideicomiso) and allocated by a district-level Sustainable Urbanism Priority Index. We separate realized revenue (municipal records, 2021–2026) from deterministic ex ante estimates calibrated to the city’s 2026 public-works programme, its buildability code, and land- and built-value maps, and we analyse incidence—who pays, who benefits.</w:t>
+      </w:r>
+    </w:p>
+    <w:p>
+      <w:pPr>
+        <w:spacing w:after="120"/>
+      </w:pPr>
+      <w:r>
+        <w:rPr>
+          <w:b/>
+        </w:rPr>
+        <w:t xml:space="preserve">Results. </w:t>
+      </w:r>
+      <w:r>
+        <w:t>Two instruments already operate: a surcharge on 5,315 idle parcels and a water-and-sewer charge whose real collections rose elevenfold in 2021–2025. The full package could raise USD 1.8–5.6 million per year (central ≈ USD 3 million), before leverage, with roughly USD 1 million already collected. Binding disbursement to the index directs investment to districts with least green space, water, and services, guarding against regressive outcomes.</w:t>
+      </w:r>
+    </w:p>
+    <w:p>
+      <w:pPr>
+        <w:spacing w:after="120"/>
+      </w:pPr>
+      <w:r>
+        <w:rPr>
+          <w:b/>
+        </w:rPr>
+        <w:t xml:space="preserve">Conclusions. </w:t>
+      </w:r>
+      <w:r>
+        <w:t>A ring-fenced, indicator-governed LVC trust fund is a bankability bridge: a replicable template that turns the land-use windfall into matched, repayable adaptation finance for water-stressed Majority-World cities.</w:t>
       </w:r>
     </w:p>
     <w:p>
@@ -161,7 +235,7 @@
         <w:t xml:space="preserve">Keywords: </w:t>
       </w:r>
       <w:r>
-        <w:t>land value capture; climate adaptation finance; municipal trust funds; water scarcity; Majority-World cities; multi-instrument coordination; incidence and equity; Argentina</w:t>
+        <w:t>land value capture; climate adaptation finance; municipal trust funds; water scarcity; Majority-World cities; incidence and equity; Argentina</w:t>
       </w:r>
     </w:p>
     <w:p>
@@ -169,39 +243,61 @@
         <w:pStyle w:val="Heading1"/>
       </w:pPr>
       <w:r>
-        <w:t>Lessons for Policymakers</w:t>
+        <w:t>Summary for Policymakers</w:t>
       </w:r>
     </w:p>
     <w:p>
       <w:pPr>
-        <w:spacing w:after="120" w:line="276" w:lineRule="auto"/>
+        <w:pStyle w:val="ListBullet"/>
+        <w:spacing w:after="40"/>
       </w:pPr>
       <w:r>
-        <w:t>A ring-fenced, indicator-governed Trust Fund is the city’s gateway to international climate finance. With a predictable, indexed LVC revenue base, the Fideicomiso is the vehicle multilateral lenders (CAF, IDB, World Bank, GCF) and bond markets are prepared to underwrite. Cities with this architecture can issue green or sustainability-linked bonds against their own revenue and borrow on their own balance sheet; cities without it remain dependent on national-government intermediation. Without earmarking, LVC proceeds dissipate into general budgets and lose both their political weight and their leverage capacity.</w:t>
+        <w:t>A ring-fenced, indicator-governed trust fund (fideicomiso) is a city’s gateway to international climate finance: it supplies both the counterpart (matching) funds and the repayment security that grants, green bonds, and facilities such as CAF, the IDB, and the Green Climate Fund require.</w:t>
       </w:r>
     </w:p>
     <w:p>
       <w:pPr>
-        <w:spacing w:after="120" w:line="276" w:lineRule="auto"/>
+        <w:pStyle w:val="ListBullet"/>
+        <w:spacing w:after="40"/>
       </w:pPr>
       <w:r>
-        <w:t>Multi-instrument coordination beats single-instrument optimisation. Betterment contributions set a predictable spatial revenue floor; participation in rezoning gains captures the largest discrete uplifts; an idle-land surcharge corrects a Pigouvian externality at the urban edge; building rights price marginal density. A package is more resilient to political cycles than any single instrument—and two of these instruments can already be collecting revenue before the others are sanctioned.</w:t>
+        <w:t>Coordinate instruments as a package and sequence by capacity: start with a vacant-land surcharge and a service-capacity charge, which can collect quickly, then add the value-capture instruments.</w:t>
       </w:r>
     </w:p>
     <w:p>
       <w:pPr>
-        <w:spacing w:after="120" w:line="276" w:lineRule="auto"/>
+        <w:pStyle w:val="ListBullet"/>
+        <w:spacing w:after="40"/>
       </w:pPr>
       <w:r>
-        <w:t>Water-scarcity adaptation is financeable with land-based revenue. Documented LVC applications cluster in coastal-flooding contexts; this case shows the architecture transfers to slow-onset, water-stressed settings, where binding hydrological constraints on developable land reinforce the capitalisation logic of LVC.</w:t>
+        <w:t>Earmark every charge to the fund by ordinance and index its base to inflation, or the proceeds dissipate into the general budget and lose their leverage.</w:t>
       </w:r>
     </w:p>
     <w:p>
       <w:pPr>
-        <w:spacing w:after="120" w:line="276" w:lineRule="auto"/>
+        <w:pStyle w:val="ListBullet"/>
+        <w:spacing w:after="40"/>
       </w:pPr>
       <w:r>
-        <w:t>Recommended actions: (i) legislate LVC instruments as a package, not piecemeal; (ii) ring-fence revenues through a Trust Fund designed from day one as a leverage vehicle; (iii) bind allocation to an indicator-based sustainability index that foregrounds incidence—who pays and who benefits; (iv) index instrument bases against inflation; (v) issue green or sustainability-linked bonds and unlock multilateral climate finance against the earmarked revenue stream.</w:t>
+        <w:t>Bind spending to a district-level priority index that foregrounds incidence—who pays, who benefits—so value captured in high-value districts funds need in deprived ones.</w:t>
+      </w:r>
+    </w:p>
+    <w:p>
+      <w:pPr>
+        <w:pStyle w:val="ListBullet"/>
+        <w:spacing w:after="40"/>
+      </w:pPr>
+      <w:r>
+        <w:t>Water-scarcity adaptation is financeable with land-based revenue: binding hydrological limits reinforce the capitalisation logic of LVC.</w:t>
+      </w:r>
+    </w:p>
+    <w:p>
+      <w:pPr>
+        <w:pStyle w:val="ListBullet"/>
+        <w:spacing w:after="40"/>
+      </w:pPr>
+      <w:r>
+        <w:t>In Luján de Cuyo two instruments already collect about USD 1 million a year; the full package could raise USD 1.8–5.6 million a year before leverage.</w:t>
       </w:r>
     </w:p>
     <w:p>
@@ -209,7 +305,7 @@
         <w:pStyle w:val="Heading1"/>
       </w:pPr>
       <w:r>
-        <w:t>1. Introduction</w:t>
+        <w:t>Background</w:t>
       </w:r>
     </w:p>
     <w:p>
@@ -217,7 +313,7 @@
         <w:pStyle w:val="Heading2"/>
       </w:pPr>
       <w:r>
-        <w:t>1.1 A finance problem disguised as an engineering problem</w:t>
+        <w:t>A finance problem disguised as an engineering problem</w:t>
       </w:r>
     </w:p>
     <w:p>
@@ -233,7 +329,7 @@
         <w:spacing w:after="120" w:line="276" w:lineRule="auto"/>
       </w:pPr>
       <w:r>
-        <w:t>This is the bankability problem at the heart of the climate-and-cities agenda. Cities are where adaptation succeeds or fails, and mayors decide; yet the pipeline of investment-ready urban projects stays thin even though adaptation routinely returns two to ten dollars on the dollar. The obstacle is structural. Adaptation benefits—water security, cooler streets, intact recharge zones—are diffuse and hard to charge for, so they seldom yield a tariff a lender can lend against. And the institutions that would assemble such projects need finance to build capacity but capacity to attract finance. The worst-served cities cannot climb out of this trap on their own.</w:t>
+        <w:t>This bias is not hypothetical; it is the observed pattern. Examining European Investment Bank climate lending in 2021–2023, Clifton et al. (2025) find that finance flowed disproportionately to large metropolitan regions—the places with the deepest institutions, the thickest pipelines, and the most technical capacity—rather than to the regions most exposed to the transition. Climate money follows capability more than need, producing a two-speed transition. If that bias holds in Europe, it holds with greater force across the Majority World. The lesson reframes the task: the binding problem for an intermediate city is not the scarcity of global capital but its own inability to compete for it. Build the capability—the revenue, the pipeline, the evidence—and the geography of climate finance can begin to shift.</w:t>
       </w:r>
     </w:p>
     <w:p>
@@ -241,7 +337,7 @@
         <w:spacing w:after="120" w:line="276" w:lineRule="auto"/>
       </w:pPr>
       <w:r>
-        <w:t>This bias is not hypothetical; it is the observed pattern. Examining European Investment Bank climate lending in 2021–2023, Clifton et al. (2025) find that finance flowed disproportionately to large metropolitan regions—the places with the deepest institutions, the thickest pipelines, and the most technical capacity—rather than to the regions most exposed to the transition. Climate money follows capability more than need, producing a two-speed transition. If that bias holds in Europe, with its dense institutions, it holds with greater force across the Majority World. The lesson reframes the task: the binding problem for an intermediate city is not the scarcity of global capital but its own inability to compete for it. Build the capability—the revenue, the pipeline, the evidence—and the geography of climate finance can begin to shift.</w:t>
+        <w:t>Building that capability begins with a resource these cities already own but rarely capture: the rise in land value that public action and urban growth create. Land prices are the urban economy’s information system; they capitalise, into one observable number, the value of access, infrastructure, regulation, and amenity. When a city paves a road, extends a water main, or rezones a vineyard for housing, it transfers wealth to whoever owns the affected land. Henry George saw the implication a century and a half ago, and the modern economics of capitalisation (Glaeser, 2011; Duranton &amp; Puga, 2015) has sharpened it: much urban land value is “unearned” by the owner, which makes it an unusually efficient and unusually fair base for public revenue.</w:t>
       </w:r>
     </w:p>
     <w:p>
@@ -249,7 +345,7 @@
         <w:spacing w:after="120" w:line="276" w:lineRule="auto"/>
       </w:pPr>
       <w:r>
-        <w:t>We argue that building that capability begins with a resource these cities already own but rarely capture: the rise in land value that public action and urban growth create. Land value capture is not new—it is among the oldest ideas in public finance—but it can be wired directly into climate adaptation, and doing so manufactures exactly the ingredient the bankability problem lacks: an own-source, ring-fenced, growing revenue stream an external financier can underwrite.</w:t>
+        <w:t>In a water-stressed region the windfall and the damage are joined at the hip. In Luján de Cuyo a hectare of vineyard rezoned for subdivision can multiply in value several-fold; the same conversion seals a permeable surface, removes a recharge area, swaps irrigation demand for higher-per-capita domestic demand, and erases a carbon sink. Private gain and collective cost are produced by one and the same act. We call this the water–land value paradox: development capitalises a premium that depends on water security while undermining the water security on which the premium depends. The paradox is also the opportunity—capturing a slice of the development-generated increment to finance water and green infrastructure closes the loop between the activity that creates the adaptation cost and the instrument that pays for the response.</w:t>
       </w:r>
     </w:p>
     <w:p>
@@ -257,7 +353,7 @@
         <w:pStyle w:val="Heading2"/>
       </w:pPr>
       <w:r>
-        <w:t>1.2 Land, water, and the windfall nobody is taxing</w:t>
+        <w:t>Literature and the gap</w:t>
       </w:r>
     </w:p>
     <w:p>
@@ -265,7 +361,7 @@
         <w:spacing w:after="120" w:line="276" w:lineRule="auto"/>
       </w:pPr>
       <w:r>
-        <w:t>Land prices are the urban economy’s information system. They capitalise, into one observable number, the value of access, infrastructure, regulation, and amenity. When a city paves a road, extends a water main, or rezones a vineyard for housing, it does not merely change the map—it transfers wealth to whoever owns the affected land. Henry George saw the implication a century and a half ago, and the modern economics of capitalisation (Glaeser, 2011; Duranton &amp; Puga, 2015) has sharpened it: much urban land value is “unearned” by the owner in any productive sense, which makes it an unusually efficient and unusually fair base for public revenue.</w:t>
+        <w:t>Land value capture recovers for the public some of the land-value increment created by public investment, regulation, or growth. Latin America has experimented with it for the better part of a century, from Colombia’s contribución de valorización to São Paulo’s auctioned building-rights certificates (CEPACs) and Brazil’s 2001 City Statute, and the toolkit is now well catalogued (Smolka, 2013; OECD &amp; Lincoln Institute, 2022). The recurring lesson is that the gap is not legal authorisation but execution: weak valuation, landowner resistance, and thin administrative capacity hollow out instruments that look powerful on paper—constraints that bite hardest in intermediate cities, understudied relative to the metropolises that supply most of the evidence.</w:t>
       </w:r>
     </w:p>
     <w:p>
@@ -273,7 +369,23 @@
         <w:spacing w:after="120" w:line="276" w:lineRule="auto"/>
       </w:pPr>
       <w:r>
-        <w:t>In a water-stressed region the windfall and the damage are joined at the hip. In Luján de Cuyo a hectare of vineyard rezoned for subdivision can multiply in value several-fold; the same conversion seals a permeable surface, removes a recharge area, swaps irrigation demand for higher-per-capita domestic demand, and erases a carbon sink. Private gain and collective cost are produced by one and the same act. We call this the water–land value paradox: development capitalises a premium that depends on water security while undermining the water security on which the premium depends. The paradox is also the opportunity. Capturing a slice of the development-generated increment to finance water and green infrastructure does not merely raise revenue; it closes the loop between the activity that creates the adaptation cost and the instrument that pays for the response.</w:t>
+        <w:t>Latin America offers both the template and the cautionary tale. Bogotá has financed major road and public-space programmes through betterment contributions (contribución de valorización); São Paulo auctions additional building rights as tradable certificates (CEPACs); and Brazil’s 2001 City Statute codified a broad menu now emulated across the region. Yet implementation is uneven: Smolka (2013) documents a persistent gap between legal authorisation and effective deployment, rooted in weak valuation, landowner resistance, and limited administrative capacity. These constraints are sharpest in intermediate cities, which combine fast peri-urban growth with thin technical staff—precisely the cities the evidence base neglects. Luján de Cuyo is therefore not a scaled-down metropolis but a distinct, and more representative, setting.</w:t>
+      </w:r>
+    </w:p>
+    <w:p>
+      <w:pPr>
+        <w:spacing w:after="120" w:line="276" w:lineRule="auto"/>
+      </w:pPr>
+      <w:r>
+        <w:t>The adaptation-finance literature, in turn, converges on a single diagnosis: the problem is less the absence of capital than the absence of bankable projects to absorb it. Adaptation goods are non-excludable and hard to monetise; municipal balance sheets are opaque or unrated; and the documentation thresholds of facilities such as the Green Climate Fund exceed what most intermediate cities can produce. The consensus—visible in the Coalition for Urban Transitions’ creditworthiness agenda and in C40’s analysis of urban adaptation, which finds that cities mobilise private investment when they can show clear revenue models, investable pipelines, and strong enabling conditions (C40 Cities &amp; GCoM, 2026)—is that own-source revenue is the hinge. Yet the LVC and climate-finance literatures have run on separate tracks; Dunning and Lord (2020) note the missing point of tangency between them. What the field lacks is a concrete, documented mechanism for generating such revenue at the intermediate-city scale and coupling it to adaptation. This paper supplies one.</w:t>
+      </w:r>
+    </w:p>
+    <w:p>
+      <w:pPr>
+        <w:spacing w:after="120" w:line="276" w:lineRule="auto"/>
+      </w:pPr>
+      <w:r>
+        <w:t>Access to reliable water is itself capitalised into land values—premiums of roughly 8 to 25 percent are reported for arid and semi-arid settings—and scarcity discounts them. Where irrigated farmland converts to housing, the price jump reflects both the change in permitted use and an implicit bet on continued water availability, even as the conversion degrades the hydrological system that justifies the bet. Coupling land value capture to adaptation is therefore not merely administratively convenient but economically coherent: the instrument taxes the very transaction that produces the externality and channels the proceeds to the investments that offset it. Treated this way, land value capture is not a revenue tool bolted onto a climate plan but an element of climate governance—linking land-use regulation, fiscal policy, and adaptation within one institutional architecture.</w:t>
       </w:r>
     </w:p>
     <w:p>
@@ -281,7 +393,7 @@
         <w:pStyle w:val="Heading2"/>
       </w:pPr>
       <w:r>
-        <w:t>1.3 What this paper does</w:t>
+        <w:t>Case and research questions</w:t>
       </w:r>
     </w:p>
     <w:p>
@@ -289,7 +401,15 @@
         <w:spacing w:after="120" w:line="276" w:lineRule="auto"/>
       </w:pPr>
       <w:r>
-        <w:t>We study Luján de Cuyo not as a model on paper but as a system under construction. Between 2023 and 2026 the municipality designed an Ordinance of Urban-Economy Instruments, created a land bank and an earmarked urban-economy fund, advanced a fideicomiso to administer them, drafted a new buildability code, and began computing a district-level priority index. We ask three questions. First, can a coordinated set of LVC instruments generate dedicated adaptation revenue in an intermediate, water-stressed, Majority-World city? Second, what institutional architecture turns that revenue into access to international climate finance? Third—and central to this journal’s concern that climate finance can entrench inequity—how can the allocation of the proceeds embed incidence and equity, directing investment to the districts that most need it while the charges fall on those who capture the windfall?</w:t>
+        <w:t>Luján de Cuyo sits at the foot of the Andes in Mendoza, in one of the world’s great wine regions and one of its drier inhabited landscapes—annual precipitation near 200 millimetres. Everything productive depends on Andean snowmelt routed through an irrigation network older than the republic. Two trends are colliding: the snowpack has thinned over three decades of warming, while the population has grown fast—the 2022 census counts about 175,000 residents, roughly 46 percent more than in 2010. Growth is eating the irrigated periphery, and each converted hectare adds domestic water demand while subtracting the permeability that recharges the aquifer. We ask three questions. First, can a coordinated set of LVC instruments generate dedicated adaptation revenue in an intermediate, water-stressed, Majority-World city? Second, what institutional architecture turns that revenue into access to international climate finance? Third—central to this journal’s concern that climate finance can entrench inequity—how can the allocation of the proceeds embed incidence and equity, directing investment to the districts that most need it while the charges fall on those who capture the windfall?</w:t>
+      </w:r>
+    </w:p>
+    <w:p>
+      <w:pPr>
+        <w:pStyle w:val="Heading1"/>
+      </w:pPr>
+      <w:r>
+        <w:t>Methods</w:t>
       </w:r>
     </w:p>
     <w:p>
@@ -297,7 +417,31 @@
         <w:spacing w:after="120" w:line="276" w:lineRule="auto"/>
       </w:pPr>
       <w:r>
-        <w:t>Our answers rest on real municipal data, and we are deliberate about the line between evidence and estimate. We report what two operational instruments actually collect; we size the designed instruments against the city’s genuine 2026 works programme, its land-value and built-value maps, and its new buildability schedule, reporting conservative, baseline, and optimistic scenarios; and we test whether planned investment goes where the priority index says it is needed. Section 2 places the argument in the literatures on land value capture, adaptation finance, and water and land markets. Section 3 introduces the case and the data. Section 4 sets out the six instruments. Section 5 develops the trust-fund architecture and its role as a matching-funds and repayment vehicle. Section 6 describes the priority index. Section 7 presents the revenue, incidence, and financing-gap estimates. Section 8 turns to transferability, and Section 9 concludes.</w:t>
+        <w:t>This is a single-case study, a design suited to documenting an institutional innovation in depth while it is still observable. Argentina’s federal arrangement gives Mendoza’s municipalities real authority over zoning, building permits, and local charges, while the province retains water rights and trunk infrastructure. Over 2023–2026 Luján de Cuyo used that authority to assemble an integrated system—an Ordinance of Urban-Economy Instruments; a Municipal Land and Real-Estate Bank and an earmarked Urban-Economy Fund (Ordinances 15081 and 15093 of 2025); an administration trust to pool the flows; a draft buildability code (COS 2026); and a district-level priority index—several components of which already operate. The case is therefore unusually well suited to study because the instruments are not hypothetical.</w:t>
+      </w:r>
+    </w:p>
+    <w:p>
+      <w:pPr>
+        <w:spacing w:after="120" w:line="276" w:lineRule="auto"/>
+      </w:pPr>
+      <w:r>
+        <w:t>The evidence is primary municipal material gathered between 2018 and 2026: the ordinances and draft instruments code; the 2026 public-works programme; the 2026 tax roll and vacant-land padrón; collection records for the operational charges; the municipal land-value, built-value, and fiscal-assessment maps; the draft COS 2026 buildability schedule and a comparative zoning analysis; and the priority-index methodology with its first district-level results. We separate two footings throughout. Realized revenue is what the two operational instruments actually collect, drawn from municipal records. Ex-ante potential, for the designed instruments, is a transparent deterministic build-up that applies the ordinance’s own formulas to real parameters—works costs, land and built values, buildability—rather than to assumed transaction volumes; because no transactions yet exist, the point estimates are illustrative, reported as conservative, baseline, and optimistic scenarios, and we are candid about the one genuinely unobserved parameter, the future take-up of instruments not yet in force. All peso figures are expressed in inflation- and exchange-rate-adjusted US dollars; the Tax Unit (Unidad Tributaria, UT) is set at its 2026 value (ARS 235) and conversions use the 2025 average rate (ARS 1,244.17/USD). Incidence is treated as a design variable: for each instrument we identify who bears the charge, and we test whether planned investment reaches the districts the index ranks as most in need.</w:t>
+      </w:r>
+    </w:p>
+    <w:p>
+      <w:pPr>
+        <w:spacing w:after="120" w:line="276" w:lineRule="auto"/>
+      </w:pPr>
+      <w:r>
+        <w:t>Each designed instrument is sized from a different real parameter, and we state the rule in each case. The betterment levy is the cost of the eligible 2026 public works multiplied by a cost-recovery share of 25–50 percent, within the ordinance’s legal ceiling. Development-rights sales are the additional buildable area absorbed each year—a take-up applied to the ceiling set by the new buildability code—multiplied by a price per square metre expressed in Tax Units and benchmarked to the municipal built-value map. Differential rent capture is sized analogously on the rezoning-driven share of that buildable demand. Realized figures, by contrast, require no assumption: they are the amounts the two operational instruments actually collected, deflated and converted. Throughout, we prefer the conservative end of plausible ranges, so the headline figures are best read as a floor.</w:t>
+      </w:r>
+    </w:p>
+    <w:p>
+      <w:pPr>
+        <w:spacing w:after="120" w:line="276" w:lineRule="auto"/>
+      </w:pPr>
+      <w:r>
+        <w:t>A single-case design is appropriate because the object of study is an institutional configuration—six instruments, a trust fund, and an allocation index—observed as it is assembled; the aim is analytical generalisation to comparable water-stressed intermediate cities, not statistical inference. We triangulate across document types (ordinances, tax rolls, works programmes, valuation maps, and the index methodology) and, where a figure is realized, cross-check ordinance text against collection records. The central methodological discipline is to keep realized revenue and ex ante potential in separate columns and never to let the second borrow the credibility of the first.</w:t>
       </w:r>
     </w:p>
     <w:p>
@@ -305,7 +449,15 @@
         <w:pStyle w:val="Heading1"/>
       </w:pPr>
       <w:r>
-        <w:t>2. Land Value Capture, Adaptation Finance, and Water</w:t>
+        <w:t>Results</w:t>
+      </w:r>
+    </w:p>
+    <w:p>
+      <w:pPr>
+        <w:spacing w:after="120" w:line="276" w:lineRule="auto"/>
+      </w:pPr>
+      <w:r>
+        <w:t>We first document the framework the case reveals—the six instruments, the trust fund, and the priority index—then report the revenue, incidence, and alignment results.</w:t>
       </w:r>
     </w:p>
     <w:p>
@@ -313,7 +465,7 @@
         <w:pStyle w:val="Heading2"/>
       </w:pPr>
       <w:r>
-        <w:t>2.1 Land value capture: a mature idea, an uneven practice</w:t>
+        <w:t>The six instruments</w:t>
       </w:r>
     </w:p>
     <w:p>
@@ -321,223 +473,7 @@
         <w:spacing w:after="120" w:line="276" w:lineRule="auto"/>
       </w:pPr>
       <w:r>
-        <w:t>Land value capture recovers for the public some of the land-value increment created by public investment, regulation, or growth. Latin America has experimented with it for the better part of a century, from Colombia’s contribución de valorización to São Paulo’s auctioned building-rights certificates (CEPACs) and Brazil’s 2001 City Statute, and the toolkit is now well catalogued (Smolka, 2013; OECD &amp; Lincoln Institute, 2022). The recurring lesson is that the gap is not legal authorisation but execution: weak valuation, landowner resistance, and thin administrative capacity hollow out instruments that look powerful on paper. Those constraints bite hardest precisely where the literature looks least—in intermediate cities, understudied relative to the metropolises that supply most of the evidence.</w:t>
-      </w:r>
-    </w:p>
-    <w:p>
-      <w:pPr>
-        <w:pStyle w:val="Heading2"/>
-      </w:pPr>
-      <w:r>
-        <w:t>2.2 The bankability gap in urban adaptation finance</w:t>
-      </w:r>
-    </w:p>
-    <w:p>
-      <w:pPr>
-        <w:spacing w:after="120" w:line="276" w:lineRule="auto"/>
-      </w:pPr>
-      <w:r>
-        <w:t>The adaptation-finance literature and the practitioner community converge on a diagnosis: the problem is less the absence of capital than the absence of bankable projects to absorb it. The Global Commission on Adaptation documented benefit–cost ratios that should make adaptation an easy sell; the cities-and-climate community has shown why it is not. Urban adaptation goods are non-excludable and hard to monetise; municipal balance sheets are opaque or unrated; and the documentation thresholds of facilities such as the Green Climate Fund exceed what most intermediate cities can produce. The emerging consensus—visible in the creditworthiness agenda of the Coalition for Urban Transitions—is that own-source revenue is the hinge: it provides counterpart funding, signals commitment, and underwrites repayment. C40’s own analysis of urban adaptation reaches the same conclusion from the practitioner side: cities mobilise private investment when they can present clear revenue models, investable project pipelines, and strong enabling conditions (C40 Cities &amp; GCoM, 2026)—the very three things the architecture in this paper is built to supply. Crucially, the LVC and climate-finance literatures have run on separate tracks; Dunning and Lord (2020) note the missing point of tangency between them. What the consensus has lacked is a concrete, documented mechanism for generating such revenue at the intermediate-city scale, and for coupling it to adaptation. That is the gap this paper addresses.</w:t>
-      </w:r>
-    </w:p>
-    <w:p>
-      <w:pPr>
-        <w:pStyle w:val="Heading2"/>
-      </w:pPr>
-      <w:r>
-        <w:t>2.3 Water, land markets, and the case for coupling</w:t>
-      </w:r>
-    </w:p>
-    <w:p>
-      <w:pPr>
-        <w:spacing w:after="120" w:line="276" w:lineRule="auto"/>
-      </w:pPr>
-      <w:r>
-        <w:t>Access to reliable water is capitalised into land values—premiums of roughly 8 to 25 percent are reported for arid and semi-arid settings—and scarcity discounts them. Where irrigated agricultural land converts to housing, the price jump reflects both the change in permitted use and an implicit bet on continued water availability, even as the conversion degrades the hydrological system that justifies the bet. Coupling LVC to adaptation is therefore not merely administratively convenient but economically coherent: the instrument taxes the transaction that produces the externality and channels the proceeds to the investments that offset it. The conceptual move here is to treat land value capture not as a revenue tool bolted onto a climate plan, but as an element of climate governance in its own right—linking land-use regulation, fiscal policy, and adaptation within one institutional architecture.</w:t>
-      </w:r>
-    </w:p>
-    <w:p>
-      <w:pPr>
-        <w:pStyle w:val="Heading1"/>
-      </w:pPr>
-      <w:r>
-        <w:t>3. Case and Method</w:t>
-      </w:r>
-    </w:p>
-    <w:p>
-      <w:pPr>
-        <w:pStyle w:val="Heading2"/>
-      </w:pPr>
-      <w:r>
-        <w:t>3.1 Luján de Cuyo: growth on a water budget</w:t>
-      </w:r>
-    </w:p>
-    <w:p>
-      <w:pPr>
-        <w:spacing w:after="120" w:line="276" w:lineRule="auto"/>
-      </w:pPr>
-      <w:r>
-        <w:t>Luján de Cuyo sits at the foot of the Andes in Mendoza, in one of the world’s great wine regions and one of its drier inhabited landscapes—annual precipitation near 200 millimetres, far below the rainfed-agriculture threshold. Everything productive depends on Andean snowmelt routed through an irrigation network older than the republic. Two trends are now colliding. The snowpack that feeds the system has thinned over three decades of warming, while the population has grown fast: the 2022 census counts about 175,000 residents, roughly 46 percent more than in 2010. Growth is eating the irrigated periphery. Vineyards and orchards that doubled as recharge zones are being subdivided, and each converted hectare adds domestic water demand while subtracting the permeability that recharges the aquifer—the water–land value paradox in its most literal form.</w:t>
-      </w:r>
-    </w:p>
-    <w:p>
-      <w:pPr>
-        <w:pStyle w:val="Heading2"/>
-      </w:pPr>
-      <w:r>
-        <w:t>3.2 An institutional opening</w:t>
-      </w:r>
-    </w:p>
-    <w:p>
-      <w:pPr>
-        <w:spacing w:after="120" w:line="276" w:lineRule="auto"/>
-      </w:pPr>
-      <w:r>
-        <w:t>Argentina’s federal arrangement gives Mendoza’s municipalities real authority over zoning, building permits, and local charges, while the province retains water rights and trunk infrastructure. Luján de Cuyo used that authority. Confronting peri-urban expansion that was generating unsustainable water demand, the municipality assembled, over 2023–2026, the legal scaffolding for an integrated system: an Ordinance of Urban-Economy Instruments; a Municipal Land and Real-Estate Bank and an earmarked Urban-Economy Fund (Ordinances 15081 and 15093 of 2025); an administration trust to pool the flows; a draft buildability code (COS 2026); and a priority index built by a municipal public-policy laboratory. The case is therefore unusually well suited to study, because the instruments are not hypothetical—they are at the edge of implementation, and some already collect revenue.</w:t>
-      </w:r>
-    </w:p>
-    <w:p>
-      <w:pPr>
-        <w:pStyle w:val="Heading2"/>
-      </w:pPr>
-      <w:r>
-        <w:t>3.3 Data and approach</w:t>
-      </w:r>
-    </w:p>
-    <w:p>
-      <w:pPr>
-        <w:spacing w:after="120" w:line="276" w:lineRule="auto"/>
-      </w:pPr>
-      <w:r>
-        <w:t>This is a single-case study built from primary municipal material gathered between 2018 and 2026: ordinances and the draft instruments code; the 2026 public-works programme; the 2026 tax roll and the vacant-land padrón; collection records for the operational charges; the municipal land-value, built-value, and fiscal-assessment maps; the draft COS 2026 buildability schedule and a comparative zoning analysis; and the priority-index methodology with its first district-level results. We are explicit throughout about the status of every figure. Revenue from the two operational instruments is realized and drawn from municipal records; estimates for the designed instruments apply the ordinance’s own formulas to real parameters—works costs, land and built values, buildability—rather than to assumed transaction volumes, and reported as conservative-to-optimistic scenarios. All peso figures are expressed in inflation-adjusted, exchange-rate-converted US dollars; the Tax Unit is set at its 2026 value (ARS 235) and conversions use the 2025 average rate (ARS 1,244.17/USD). Where a parameter is genuinely unobserved—above all the future take-up of instruments not yet in force—we say so and bound it.</w:t>
-      </w:r>
-    </w:p>
-    <w:p>
-      <w:pPr>
-        <w:pStyle w:val="Heading1"/>
-      </w:pPr>
-      <w:r>
-        <w:t>4. Six Land Value Capture Instruments</w:t>
-      </w:r>
-    </w:p>
-    <w:p>
-      <w:pPr>
-        <w:spacing w:after="120" w:line="276" w:lineRule="auto"/>
-      </w:pPr>
-      <w:r>
-        <w:t>The framework coordinates six instruments, each catching the increment at a different point in the land-development cycle. They are designed to function as a system, not a menu: what one instrument leaves on the table another recovers, and all of them drain into the same fund.</w:t>
-      </w:r>
-    </w:p>
-    <w:p>
-      <w:pPr>
-        <w:pStyle w:val="Heading2"/>
-      </w:pPr>
-      <w:r>
-        <w:t>4.1 Betterment contributions (Contribución por Mejoras)</w:t>
-      </w:r>
-    </w:p>
-    <w:p>
-      <w:pPr>
-        <w:spacing w:after="120" w:line="276" w:lineRule="auto"/>
-      </w:pPr>
-      <w:r>
-        <w:t>When a public work raises the value of nearby property, the betterment contribution recovers part of that increment from the owners who gained. In Luján de Cuyo it attaches to investments in water distribution, stormwater and aquifer-recharge infrastructure, and public green space, with benefit zones delineated by GIS and the charge set as a share of the assessed uplift—typically 30 to 50 percent—payable in instalments to spare lower-income households. Water-related betterment revenue is earmarked to the adaptation fund, so the instrument both finances the work and demonstrates, in cash, that the work paid.</w:t>
-      </w:r>
-    </w:p>
-    <w:p>
-      <w:pPr>
-        <w:pStyle w:val="Heading2"/>
-      </w:pPr>
-      <w:r>
-        <w:t>4.2 Differential rent capture from rezoning (Participación en la Valoración de Activos)</w:t>
-      </w:r>
-    </w:p>
-    <w:p>
-      <w:pPr>
-        <w:spacing w:after="120" w:line="276" w:lineRule="auto"/>
-      </w:pPr>
-      <w:r>
-        <w:t>Rezoning is the single largest manufacturer of unearned increment, and this instrument taxes it directly: owners who benefit from a change of use or a rise in permitted intensity contribute a share of the difference between the pre- and post-decision value. Its logic is the paper’s logic in miniature. Every conversion of permeable agricultural land to impervious residential use triggers, in the same instrument, both the recognition of a private gain and a payment toward the public response.</w:t>
-      </w:r>
-    </w:p>
-    <w:p>
-      <w:pPr>
-        <w:pStyle w:val="Heading2"/>
-      </w:pPr>
-      <w:r>
-        <w:t>4.3 Vacant-land charges (Sobretasa al Baldío)</w:t>
-      </w:r>
-    </w:p>
-    <w:p>
-      <w:pPr>
-        <w:spacing w:after="120" w:line="276" w:lineRule="auto"/>
-      </w:pPr>
-      <w:r>
-        <w:t>A progressive surcharge on serviced but idle parcels pushes development inward and penalises speculation, doing double duty for adaptation: it favours compact growth over sprawl into recharge areas, and it raises revenue from land that is consuming infrastructure capacity while producing nothing. It is also, as Section 7 shows, already operational.</w:t>
-      </w:r>
-    </w:p>
-    <w:p>
-      <w:pPr>
-        <w:pStyle w:val="Heading2"/>
-      </w:pPr>
-      <w:r>
-        <w:t>4.4 Development-rights sales (Suelo Creado / Derechos de Construcción Adicional)</w:t>
-      </w:r>
-    </w:p>
-    <w:p>
-      <w:pPr>
-        <w:spacing w:after="120" w:line="276" w:lineRule="auto"/>
-      </w:pPr>
-      <w:r>
-        <w:t>Adapting the Brazilian CEPAC idea to an intermediate-city scale, the municipality sells the right to build above a base floor-area line up to a defined maximum, pricing the rights against reference land values and offering density bonuses for water-efficient design. The new COS 2026 code turns this from a concept into a calibrated schedule (Section 7.3).</w:t>
-      </w:r>
-    </w:p>
-    <w:p>
-      <w:pPr>
-        <w:pStyle w:val="Heading2"/>
-      </w:pPr>
-      <w:r>
-        <w:t>4.5 Tax incentives for climate-responsive development</w:t>
-      </w:r>
-    </w:p>
-    <w:p>
-      <w:pPr>
-        <w:spacing w:after="120" w:line="276" w:lineRule="auto"/>
-      </w:pPr>
-      <w:r>
-        <w:t>Reduced permit fees, property-tax rebates, or development-charge relief reward water-efficiency technology, permeable-surface minimums, tree retention, and green-building standards. Set against the other instruments, the incentives create a gradient: conversion without adaptation features faces the full weight of betterment and rent capture, while adaptation-aligned projects earn relief. The gradient is how the system internalises the externality of land conversion.</w:t>
-      </w:r>
-    </w:p>
-    <w:p>
-      <w:pPr>
-        <w:pStyle w:val="Heading2"/>
-      </w:pPr>
-      <w:r>
-        <w:t>4.6 Transferable development rights</w:t>
-      </w:r>
-    </w:p>
-    <w:p>
-      <w:pPr>
-        <w:spacing w:after="120" w:line="276" w:lineRule="auto"/>
-      </w:pPr>
-      <w:r>
-        <w:t>To protect recharge zones, riparian buffers, and farmland without buying them outright, owners in “sending” areas receive rights they can sell to developers in “receiving” areas. The instrument addresses the most politically charged part of adaptation in an agricultural region—restricting development on private land—by compensating it through the market rather than the budget.</w:t>
-      </w:r>
-    </w:p>
-    <w:p>
-      <w:pPr>
-        <w:pStyle w:val="Heading2"/>
-      </w:pPr>
-      <w:r>
-        <w:t>4.7 Coordination</w:t>
-      </w:r>
-    </w:p>
-    <w:p>
-      <w:pPr>
-        <w:spacing w:after="120" w:line="276" w:lineRule="auto"/>
-      </w:pPr>
-      <w:r>
-        <w:t>Read together (Table 1), the instruments span the development cycle from rezoning through construction to idle holding, and they share one destination. Coordination is what converts six modest charges into a revenue system robust enough to underwrite external finance.</w:t>
+        <w:t>The framework coordinates six instruments, each catching the increment at a different point in the development cycle and designed to work as a system rather than a menu (Table 1).</w:t>
       </w:r>
     </w:p>
     <w:tbl>
@@ -653,7 +589,7 @@
               <w:rPr>
                 <w:sz w:val="18"/>
               </w:rPr>
-              <w:t>30–50% of uplift</w:t>
+              <w:t>30-50% of uplift</w:t>
             </w:r>
           </w:p>
         </w:tc>
@@ -711,7 +647,7 @@
               <w:rPr>
                 <w:sz w:val="18"/>
               </w:rPr>
-              <w:t>30–50% of differential</w:t>
+              <w:t>30-50% of differential</w:t>
             </w:r>
           </w:p>
         </w:tc>
@@ -972,15 +908,23 @@
           <w:i/>
           <w:sz w:val="18"/>
         </w:rPr>
-        <w:t>Table 1: The six instruments, their triggers, and their adaptation functions.</w:t>
+        <w:t>Table 1. The six instruments, their triggers, and their adaptation functions.</w:t>
       </w:r>
     </w:p>
     <w:p>
       <w:pPr>
-        <w:pStyle w:val="Heading1"/>
+        <w:spacing w:after="120" w:line="276" w:lineRule="auto"/>
       </w:pPr>
       <w:r>
-        <w:t>5. Institutional Architecture: The Climate Adaptation Trust Fund</w:t>
+        <w:t>Betterment contributions recover 30 to 50 percent of the assessed uplift that a public work confers on nearby property, with benefit zones drawn by GIS and water-related revenue earmarked to the adaptation fund; the instrument both finances the work and demonstrates, in cash, that the work paid. Differential rent capture taxes the uplift from rezoning—again 30 to 50 percent of the before/after differential—linking, in a single instrument, the conversion of permeable agricultural land that creates the adaptation cost to the payment that funds the response. A progressive vacant-land surcharge falls on serviced but idle parcels, pushing development inward, penalising speculation, and—because it rides on the existing tax roll—collecting almost immediately.</w:t>
+      </w:r>
+    </w:p>
+    <w:p>
+      <w:pPr>
+        <w:spacing w:after="120" w:line="276" w:lineRule="auto"/>
+      </w:pPr>
+      <w:r>
+        <w:t>Development-rights sales adapt the Brazilian CEPAC model to an intermediate-city scale, pricing the right to build above a base floor-area line up to a defined maximum and offering density bonuses for water-efficient design. Tax incentives reward permeable surfaces, tree retention, and green-building standards, creating a gradient in which conversion without adaptation features pays the full charge while adaptation-aligned projects earn relief. Transferable development rights protect recharge zones and farmland through the market rather than the budget. Two design rules matter more than the exact rates: index every base to inflation, which in a volatile economy is the difference between a live instrument and a dead one; and earmark every peso to the trust fund by ordinance at the moment the instrument is created, before the general budget learns to depend on it.</w:t>
       </w:r>
     </w:p>
     <w:p>
@@ -988,7 +932,7 @@
         <w:pStyle w:val="Heading2"/>
       </w:pPr>
       <w:r>
-        <w:t>5.1 Why a trust fund</w:t>
+        <w:t>The trust fund as a matching-funds and repayment vehicle</w:t>
       </w:r>
     </w:p>
     <w:p>
@@ -996,7 +940,7 @@
         <w:spacing w:after="120" w:line="276" w:lineRule="auto"/>
       </w:pPr>
       <w:r>
-        <w:t>Routing the proceeds through a dedicated trust fund rather than the general budget is the decision that makes the rest work. Practically, earmarking creates the predictable, multi-year revenue that infrastructure planning requires. Strategically, it attacks the bankability problem head-on: it produces a visible, auditable pool of own-source money an external financier can inspect as evidence of commitment and of capacity to repay.</w:t>
+        <w:t>Routing every instrument’s proceeds through a dedicated trust fund (fideicomiso), legally distinct from the general budget, is the decision that makes the rest work: a ring-fenced, audited pool is the collateral a financier can see, and legal separation protects it from reallocation during fiscal stress. In Luján de Cuyo this is already law—Ordinances 15081 and 15093 of 2025 created the Land and Real-Estate Bank (BMTI) and the Urban-Economy Fund (FEULDC), with an administration trust to pool the flows.</w:t>
       </w:r>
     </w:p>
     <w:p>
@@ -1004,7 +948,7 @@
         <w:spacing w:after="120" w:line="276" w:lineRule="auto"/>
       </w:pPr>
       <w:r>
-        <w:t>In Luján de Cuyo this is already taking legal form. Ordinances 15081 and 15093 of 2025 created the Municipal Land and Real-Estate Bank (BMTI) and the Urban-Economy Fund (FEULDC), an earmarked patrimony into which the value-capture instruments, the vacant-land surcharge, and the water-and-sewer charge are all directed; an administration trust (fideicomiso) is the vehicle intended to pool and channel them, with its implementing decree pending at the time of writing. The architecture described here is thus the financial layer of a system already being built.</w:t>
+        <w:t>The fund splits net revenue into three sub-accounts: an Infrastructure Investment Account (about 60 percent) for capital works in water efficiency, aquifer recharge, stormwater, and green infrastructure; a Maintenance and Operations Account (about 25 percent), the line that grant-funded projects most often forget; and a Leverage Account (about 15 percent) that accumulates the counterpart reserve external facilities require. Governance is part of the collateral: a board pairing the executive—mayor, planning director, comptroller—with two external trustees, a qualified-majority rule that blocks unilateral diversion, and published independent audits.</w:t>
       </w:r>
     </w:p>
     <w:p>
@@ -1012,7 +956,15 @@
         <w:spacing w:after="120" w:line="276" w:lineRule="auto"/>
       </w:pPr>
       <w:r>
-        <w:t>The fund operates as a fiduciary mechanism legally distinct from the general budget, with a board of trustees, transparent procedures, independent audit, and defined investment rules. That separation protects adaptation revenue from raids during fiscal stress, supplies the governance green-bond investors expect, and gives climate adaptation an institutional home.</w:t>
+        <w:t>The structure solves the two conditions that most often disqualify intermediate-city projects from green finance: no counterpart funds and no credible repayment source. On matching funds, the Leverage Account compounds a dedicated reserve—about USD 0.45 million a year at a USD 3 million baseline—enough within two or three years to anchor the 10-30 percent counterpart that bilateral facilities and the Green Climate Fund’s Simplified Approval Process expect. On repayment, the same predictable, segregated flows service debt: the water-and-sewer series below is exactly the kind of ring-fenced cash flow against which a debt-service-coverage ratio can be computed and a bond rated. A green-bond issuance of three to four times annual revenue—on the order of USD 9-12 million at the baseline, and more as the package matures—is serviceable from the dedicated streams. The fideicomiso thus converts locally captured land value into matched, repayable, and ultimately larger flows of international climate finance, building credibility for progressively larger facilities (CAF, the IDB, the World Bank, the Green Climate Fund) one delivered project at a time.</w:t>
+      </w:r>
+    </w:p>
+    <w:p>
+      <w:pPr>
+        <w:spacing w:after="120" w:line="276" w:lineRule="auto"/>
+      </w:pPr>
+      <w:r>
+        <w:t>Transparency is not housekeeping here; it is the collateral. Independent annual audits, quarterly statements published on the municipal website, and a board on which two external trustees sit alongside the executive give a lender something to underwrite and residents something to trust. The same openness underpins the political bargain discussed below: when the public can trace a rezoning charge to a named project in a named district, the instrument reads as adaptation finance rather than as a discretionary tax.</w:t>
       </w:r>
     </w:p>
     <w:p>
@@ -1020,7 +972,7 @@
         <w:pStyle w:val="Heading2"/>
       </w:pPr>
       <w:r>
-        <w:t>5.2 Pooling and fund structure</w:t>
+        <w:t>The priority index</w:t>
       </w:r>
     </w:p>
     <w:p>
@@ -1028,135 +980,7 @@
         <w:spacing w:after="120" w:line="276" w:lineRule="auto"/>
       </w:pPr>
       <w:r>
-        <w:t>The fund pools all six instruments—together with the operational water-and-sewer charge—into three sub-accounts. The Infrastructure Investment Account (60 percent of net revenue) funds capital works: water efficiency, aquifer recharge, stormwater, and green infrastructure. The Maintenance and Operations Account (25 percent) keeps that infrastructure working. The Leverage Account (15 percent) accumulates the reserve earmarked as matching funds—the own-source counterpart that grants and climate facilities require. In the municipal design this pooled patrimony is the FEULDC.</w:t>
-      </w:r>
-    </w:p>
-    <w:p>
-      <w:pPr>
-        <w:pStyle w:val="Heading2"/>
-      </w:pPr>
-      <w:r>
-        <w:t>5.3 Leveraging international climate finance</w:t>
-      </w:r>
-    </w:p>
-    <w:p>
-      <w:pPr>
-        <w:spacing w:after="120" w:line="276" w:lineRule="auto"/>
-      </w:pPr>
-      <w:r>
-        <w:t>The structure is built to support three escalating levels of leverage, and it is the fiduciary form—not the cash alone—that makes each one credible. First, accumulated Leverage Account reserves serve as the 10–30 percent counterpart that bilateral and multilateral grants demand; because that match is the binding constraint for most intermediate cities, a ring-fenced own-source pool turns unreachable grants into reachable ones. Second, the predictable, legally segregated revenue can be pledged as the repayment source and security for a green bond or a concessional loan: the fideicomiso isolates the pledged flows from the general budget and from political reallocation, which is precisely the assurance bond investors and development banks require. Third, a demonstrated record of disbursing funds, building works, and servicing debt—legible in audited accounts—earns the credibility for larger facilities such as the Green Climate Fund, the GEF, or the climate windows of CAF and the IDB.</w:t>
-      </w:r>
-    </w:p>
-    <w:p>
-      <w:pPr>
-        <w:spacing w:after="120" w:line="276" w:lineRule="auto"/>
-      </w:pPr>
-      <w:r>
-        <w:t>The strategy is deliberately incremental. Early revenue finances small, demonstrable projects; their success, plus transparent governance, positions the city for progressively larger rounds. Credibility, like capital, compounds.</w:t>
-      </w:r>
-    </w:p>
-    <w:p>
-      <w:pPr>
-        <w:pStyle w:val="Heading2"/>
-      </w:pPr>
-      <w:r>
-        <w:t>5.4 Governance and accountability</w:t>
-      </w:r>
-    </w:p>
-    <w:p>
-      <w:pPr>
-        <w:spacing w:after="120" w:line="276" w:lineRule="auto"/>
-      </w:pPr>
-      <w:r>
-        <w:t>The board pairs the mayor, the planning director, and the comptroller with two external members—one from the agricultural sector, one with environmental-finance expertise—and requires a qualified majority, which blocks unilateral diversion. Independent annual audits and quarterly statements are published on the municipal website. Transparency here is not housekeeping; it is the collateral.</w:t>
-      </w:r>
-    </w:p>
-    <w:p>
-      <w:pPr>
-        <w:pStyle w:val="Heading2"/>
-      </w:pPr>
-      <w:r>
-        <w:t>5.5 The trust fund as a matching-funds and repayment vehicle</w:t>
-      </w:r>
-    </w:p>
-    <w:p>
-      <w:pPr>
-        <w:spacing w:after="120" w:line="276" w:lineRule="auto"/>
-      </w:pPr>
-      <w:r>
-        <w:t>The decisive advantage of the fideicomiso is that it solves the two conditions that most often disqualify intermediate-city adaptation projects from international green finance: no counterpart funds and no credible repayment source. The fund supplies both from the same pooled revenue.</w:t>
-      </w:r>
-    </w:p>
-    <w:p>
-      <w:pPr>
-        <w:spacing w:after="120" w:line="276" w:lineRule="auto"/>
-      </w:pPr>
-      <w:r>
-        <w:t>On matching funds, the Leverage Account compounds a dedicated co-financing reserve. At a near-term revenue of roughly USD 3 million a year (Section 7), it adds on the order of USD 0.45 million annually—enough within two or three years to anchor the counterpart for grants in the USD 2–10 million range, including the Green Climate Fund’s Simplified Approval Process. Own-source matching is read by financiers as a costly signal of genuine commitment, and is scored heavily in funding proposals.</w:t>
-      </w:r>
-    </w:p>
-    <w:p>
-      <w:pPr>
-        <w:spacing w:after="120" w:line="276" w:lineRule="auto"/>
-      </w:pPr>
-      <w:r>
-        <w:t>On repayment, the same flows service debt. The water-and-sewer series—elevenfold real growth over 2021–2025 (Section 7.2)—is exactly the kind of demonstrated, ring-fenced cash flow against which a debt-service-coverage ratio can be computed and a bond rated. Pledging the fund’s flows through the fideicomiso rather than the general budget raises the effective seniority of repayment and lowers the risk premium. A green-bond issuance of three to four times annual revenue—on the order of USD 9–12 million at the baseline, and more as the package matures—is serviceable from the dedicated streams and would finance a first tranche of the deficits the priority index identifies.</w:t>
-      </w:r>
-    </w:p>
-    <w:p>
-      <w:pPr>
-        <w:spacing w:after="120" w:line="276" w:lineRule="auto"/>
-      </w:pPr>
-      <w:r>
-        <w:t>The fideicomiso also de-risks the instrument for the city itself: because adaptation revenue is legally separated, it cannot be spent on payroll in a bad year, which protects both the investment programme and the repayment pledge across electoral cycles. The trust fund, in short, is not an accounting convenience. It is the bridge that converts locally captured land value into matched, repayable, and ultimately larger flows of international climate finance.</w:t>
-      </w:r>
-    </w:p>
-    <w:p>
-      <w:pPr>
-        <w:pStyle w:val="Heading1"/>
-      </w:pPr>
-      <w:r>
-        <w:t>6. The Priority Index (Índice de Ciudad Deseada)</w:t>
-      </w:r>
-    </w:p>
-    <w:p>
-      <w:pPr>
-        <w:pStyle w:val="Heading2"/>
-      </w:pPr>
-      <w:r>
-        <w:t>6.1 Purpose</w:t>
-      </w:r>
-    </w:p>
-    <w:p>
-      <w:pPr>
-        <w:spacing w:after="120" w:line="276" w:lineRule="auto"/>
-      </w:pPr>
-      <w:r>
-        <w:t>A revenue framework is only as good as the rule that spends the money. The municipality’s priority index—the Índice de Ciudad Deseada and its companion infrastructure-prioritisation index—is a composite, district-level instrument that ranks where investment is most needed, embeds climate and equity criteria in that ranking, and produces the quantitative evidence external financiers ask for. It is built and updated by the municipal public-policy laboratory and is designed to be recomputed annually.</w:t>
-      </w:r>
-    </w:p>
-    <w:p>
-      <w:pPr>
-        <w:pStyle w:val="Heading2"/>
-      </w:pPr>
-      <w:r>
-        <w:t>6.2 Structure</w:t>
-      </w:r>
-    </w:p>
-    <w:p>
-      <w:pPr>
-        <w:spacing w:after="120" w:line="276" w:lineRule="auto"/>
-      </w:pPr>
-      <w:r>
-        <w:t>The index spans six dimensions and some two dozen indicators, each scored against desired values. Green space and biodiversity measures public green-space provision, walking access, and square metres per inhabitant. Mobility and services measures proximity to the Metrotranvía and bus network and to cycle infrastructure. Compactness and functionality covers dwelling and population density, street permeability, vacant dwellings, and air quality. Accessibility to community services measures walking proximity to education, health, sport, culture, and basic retail. Equity and community draws on census data for overcrowding, housing quality, schooling, and health coverage. Basic infrastructure—the dimension closest to the water-stress framing—captures water demand (demanda hídrica), network connectivity, recycling and green points, and the energy use and self-generation of public space.</w:t>
-      </w:r>
-    </w:p>
-    <w:p>
-      <w:pPr>
-        <w:spacing w:after="120" w:line="276" w:lineRule="auto"/>
-      </w:pPr>
-      <w:r>
-        <w:t>Two features matter for adaptation. Water enters the index three times—as green infrastructure, as the water-demand indicator, and through compactness, which lowers per-capita demand—so the index is, in effect, a water-stress instrument wearing a livability label. And it is spatial: every indicator is computed by district, so the framework knows not only what is short but where.</w:t>
+        <w:t>A revenue framework is only as good as the rule that spends the money. The municipality’s Índice de Ciudad Deseada is a composite, district-level index spanning six dimensions and some two dozen indicators (Table 2): green space and biodiversity; mobility and services; compactness and functionality; accessibility to community services; equity and community; and basic infrastructure—the dimension closest to the water-stress framing, capturing water demand (demanda hídrica), network connectivity, and the energy use of public space. Water enters the index three times—as green infrastructure, as the water-demand indicator, and through compactness, which lowers per-capita demand—and every indicator is computed by district, so the framework knows not only what is short but where.</w:t>
       </w:r>
     </w:p>
     <w:tbl>
@@ -1242,7 +1066,7 @@
               <w:rPr>
                 <w:sz w:val="18"/>
               </w:rPr>
-              <w:t>Public green-space %, 5-min access, m²/inhabitant</w:t>
+              <w:t>Public green-space %, 5-min access, m2/inhabitant</w:t>
             </w:r>
           </w:p>
         </w:tc>
@@ -1491,7 +1315,7 @@
           <w:i/>
           <w:sz w:val="18"/>
         </w:rPr>
-        <w:t>Table 2: The six dimensions of the priority index, with sample indicators. Each is scored per district on a five-level sufficiency scale (§6.3). Source: Municipalidad de Luján de Cuyo, Laboratorio de Políticas Públicas.</w:t>
+        <w:t>Table 2. The six dimensions of the priority index, with sample indicators, scored per district on a five-level sufficiency scale (A, &gt;=90%, to E, &lt;25%; a lower grade means a higher investment priority). Source: Municipalidad de Luján de Cuyo, Laboratorio de Políticas Públicas. UT, Unidad Tributaria.</w:t>
       </w:r>
     </w:p>
     <w:p>
@@ -1499,7 +1323,7 @@
         <w:pStyle w:val="Heading2"/>
       </w:pPr>
       <w:r>
-        <w:t>6.3 Scoring and use</w:t>
+        <w:t>Realized revenue: the two operational instruments</w:t>
       </w:r>
     </w:p>
     <w:p>
@@ -1507,55 +1331,7 @@
         <w:spacing w:after="120" w:line="276" w:lineRule="auto"/>
       </w:pPr>
       <w:r>
-        <w:t>Rather than a single weighted average, the index grades each district against the desired value on a five-level sufficiency scale: A, outstanding (≥90%); B (70–89%); C (50–69%); D, insufficient (25–49%); E, very insufficient (&lt;25%). The lower the grade, the higher the priority—“a menor cobertura, mayor priorización.” Grades aggregate into a district profile and a department-wide ranking, answering two questions: which work each district most needs, and which districts are furthest from the desired city. As of October 2025 the green-space dimension has been computed district by district; the others are being assembled, and composite weights are not yet fixed, so the index currently reports dimension-level sufficiency rather than one blended score. Section 7.5 uses that first dimension to ask a pointed question with direct equity content: is the city investing where its own index says it should?</w:t>
-      </w:r>
-    </w:p>
-    <w:p>
-      <w:pPr>
-        <w:pStyle w:val="Heading1"/>
-      </w:pPr>
-      <w:r>
-        <w:t>7. Revenue Potential, Incidence, and Financial Projections</w:t>
-      </w:r>
-    </w:p>
-    <w:p>
-      <w:pPr>
-        <w:pStyle w:val="Heading2"/>
-      </w:pPr>
-      <w:r>
-        <w:t>7.1 Method and data</w:t>
-      </w:r>
-    </w:p>
-    <w:p>
-      <w:pPr>
-        <w:spacing w:after="120" w:line="276" w:lineRule="auto"/>
-      </w:pPr>
-      <w:r>
-        <w:t>We report revenue on two footings and never blur them. Realized revenue is what the two operational instruments actually collect—the water-and-sewer charge (records 2021–2025) and the vacant-land surcharge (the 2026 tax roll)—expressed in inflation- and exchange-rate-adjusted dollars. Ex-ante potential covers the designed instruments—betterment, differential rent capture, and development-rights sales—through a transparent deterministic build-up, instrument by instrument, from the real parameters that follow: the 2026 works programme, the COS 2026 buildability schedule, and the land- and built-value maps. Because no transactions exist for these instruments yet, the point estimates are illustrative; we report conservative, baseline, and optimistic scenarios and are candid about the one genuinely unobserved parameter—the future annual take-up of instruments not yet in force. The Tax Unit is at its 2026 value (ARS 235) and conversions use ARS 1,244.17/USD.</w:t>
-      </w:r>
-    </w:p>
-    <w:p>
-      <w:pPr>
-        <w:pStyle w:val="Heading2"/>
-      </w:pPr>
-      <w:r>
-        <w:t>7.2 Realized revenue: the two operational instruments</w:t>
-      </w:r>
-    </w:p>
-    <w:p>
-      <w:pPr>
-        <w:spacing w:after="120" w:line="276" w:lineRule="auto"/>
-      </w:pPr>
-      <w:r>
-        <w:t>The clearest proof that land-based revenue can scale is the water-and-sewer feasibility contribution, a charge levied to secure service capacity for new development. Collections climbed from USD 60,699 in 2021 to USD 690,497 in 2025—an elevenfold real increase, a compound annual growth rate of 83.7 percent once inflation and devaluation are stripped out (Table 3). A land-linked own-source charge became a material revenue line in four years, through one of the most turbulent macroeconomic episodes in Argentine memory. It is not one of the six value-capture instruments, but it is the framework’s proof of concept in hard cash.</w:t>
-      </w:r>
-    </w:p>
-    <w:p>
-      <w:pPr>
-        <w:spacing w:after="120" w:line="276" w:lineRule="auto"/>
-      </w:pPr>
-      <w:r>
-        <w:t>The vacant-land surcharge—one of the six—supplies the second data point. The 2026 roll identifies 5,315 idle parcels: 4,996 taxed at a 100-percent surcharge and 319 at 200 percent in priority urban voids. The surcharge adds about ARS 493 million to the 2026 emission; net of collection losses the municipality expects roughly ARS 345 million (USD 277,539), about ARS 93,000 per lot. Together the two operational instruments already yield on the order of USD 0.97 million a year—audited, bankable revenue that exists before a single value-capture instrument is sanctioned.</w:t>
+        <w:t>The clearest proof that land-based revenue can scale is the water-and-sewer feasibility contribution, levied to secure service capacity for new development. Collections climbed from USD 60,699 in 2021 to USD 690,497 in 2025—an elevenfold real increase, a compound annual growth rate of 83.7 percent once inflation and devaluation are stripped out (Table 3)—through one of the most turbulent macroeconomic episodes in Argentine memory. The vacant-land surcharge supplies the second data point: the 2026 roll identifies 5,315 idle parcels (4,996 at a 100-percent surcharge, 319 at 200 percent in priority urban voids), adding about ARS 493 million to the 2026 emission and yielding, net of collection losses, roughly ARS 345 million (USD 277,539). Together the two operational instruments already yield on the order of USD 0.97 million a year—audited, bankable revenue that exists before a single value-capture instrument is sanctioned.</w:t>
       </w:r>
     </w:p>
     <w:tbl>
@@ -1671,7 +1447,7 @@
               <w:rPr>
                 <w:sz w:val="18"/>
               </w:rPr>
-              <w:t>–</w:t>
+              <w:t>-</w:t>
             </w:r>
           </w:p>
         </w:tc>
@@ -1729,7 +1505,7 @@
               <w:rPr>
                 <w:sz w:val="18"/>
               </w:rPr>
-              <w:t>–</w:t>
+              <w:t>-</w:t>
             </w:r>
           </w:p>
         </w:tc>
@@ -1787,7 +1563,7 @@
               <w:rPr>
                 <w:sz w:val="18"/>
               </w:rPr>
-              <w:t>–</w:t>
+              <w:t>-</w:t>
             </w:r>
           </w:p>
         </w:tc>
@@ -1845,7 +1621,7 @@
               <w:rPr>
                 <w:sz w:val="18"/>
               </w:rPr>
-              <w:t>–</w:t>
+              <w:t>-</w:t>
             </w:r>
           </w:p>
         </w:tc>
@@ -1903,7 +1679,7 @@
               <w:rPr>
                 <w:sz w:val="18"/>
               </w:rPr>
-              <w:t>–</w:t>
+              <w:t>-</w:t>
             </w:r>
           </w:p>
         </w:tc>
@@ -1947,7 +1723,7 @@
               <w:rPr>
                 <w:sz w:val="18"/>
               </w:rPr>
-              <w:t>–</w:t>
+              <w:t>-</w:t>
             </w:r>
           </w:p>
         </w:tc>
@@ -1990,7 +1766,15 @@
           <w:i/>
           <w:sz w:val="18"/>
         </w:rPr>
-        <w:t>Table 3: Realized revenue from the two operational instruments (FX- and inflation-adjusted USD). Water &amp; sewer real CAGR 2021–2025 = 83.7% (≈11× real growth). Vacant-land surcharge from the 2026 tax roll (5,315 lots; ≈ARS 345 million). Source: municipal records and 2026 padrón; INDEC and official ARS/USD series.</w:t>
+        <w:t>Table 3. Realized revenue from the two operational instruments (FX- and inflation-adjusted USD). Water &amp; sewer real CAGR 2021-2025 = 83.7%. Source: municipal records and 2026 padrón; INDEC and official ARS/USD series. CAGR, compound annual growth rate; FX, foreign exchange.</w:t>
+      </w:r>
+    </w:p>
+    <w:p>
+      <w:pPr>
+        <w:spacing w:after="120" w:line="276" w:lineRule="auto"/>
+      </w:pPr>
+      <w:r>
+        <w:t>The eleven-fold rise is not an accounting artefact: it survives deflation by the consumer-price index and conversion at the official exchange rate, so it reflects real growth in the charge’s purchasing power, not merely peso inflation. Three forces drive it—sustained development pressure on the irrigated periphery, an instrument base indexed to keep pace with prices, and steady improvement in billing and collection. The lesson for other cities is that a land-linked charge, properly indexed and administered, can become a material revenue line within a single mandate, even amid extreme macroeconomic volatility; the framework’s feasibility is demonstrated, not merely projected.</w:t>
       </w:r>
     </w:p>
     <w:p>
@@ -1998,7 +1782,7 @@
         <w:pStyle w:val="Heading2"/>
       </w:pPr>
       <w:r>
-        <w:t>7.3 Ex-ante potential of the value-capture instruments</w:t>
+        <w:t>Ex-ante potential of the value-capture instruments</w:t>
       </w:r>
     </w:p>
     <w:p>
@@ -2006,15 +1790,7 @@
         <w:spacing w:after="120" w:line="276" w:lineRule="auto"/>
       </w:pPr>
       <w:r>
-        <w:t>The betterment levy is sized against the city’s real 2026 public-works programme (Table 4), which budgets about ARS 6.85 billion (USD 5.5 million) across ten municipally funded projects. We classify each by two attributes that matter here: its planning-priority weight (80 percent for priority-1 works, 20 percent for priority-2) and its environmental-adaptation impact. The latter is the point of the exercise. Works of high or medium-high environmental impact—the stormwater drainage inside the Ciudad de Luján centrality, the new green microplazas, the Tierra del Fuego boulevard, and the canal bridge that carries the metrotranvía connection—account for roughly ARS 4.7 billion, about 69 percent of the programme. A betterment levy that earmarks revenue to the adaptation fund is therefore recovering the cost of works that are, in the main, themselves adaptation.</w:t>
-      </w:r>
-    </w:p>
-    <w:p>
-      <w:pPr>
-        <w:spacing w:after="120" w:line="276" w:lineRule="auto"/>
-      </w:pPr>
-      <w:r>
-        <w:t>To size the levy, we apply the priority weights and set aside the network-level canal bridge, whose benefit is too diffuse to attribute to adjacent owners. That leaves a betterment-eligible, priority-weighted base of about ARS 3.49 billion (USD 2.81 million). Recovering 25 to 50 percent—within the ordinance’s ceilings—yields roughly ARS 0.87–1.75 billion a year (USD 0.70–1.40 million).</w:t>
+        <w:t>The betterment levy is sized against the city’s real 2026 public-works programme (Table 4), which budgets about ARS 6.85 billion (USD 5.5 million) across ten municipally funded projects. Works of high or medium-high environmental impact—stormwater drainage in the Ciudad de Luján centrality, green microplazas, the Tierra del Fuego boulevard, and the canal bridge carrying the metrotranvía connection—account for roughly ARS 4.7 billion, about 69 percent of the programme, so a betterment levy earmarked to the adaptation fund largely recovers the cost of works that are themselves adaptation. Applying the programme’s planning-priority weights and setting aside the network-level canal bridge leaves a betterment-eligible base of about ARS 3.49 billion (USD 2.81 million); recovering 25 to 50 percent yields roughly USD 0.70-1.40 million a year.</w:t>
       </w:r>
     </w:p>
     <w:tbl>
@@ -2102,7 +1878,7 @@
                 <w:b/>
                 <w:sz w:val="18"/>
               </w:rPr>
-              <w:t>Env.–adaptation impact</w:t>
+              <w:t>Env.-adaptation impact</w:t>
             </w:r>
           </w:p>
         </w:tc>
@@ -2132,7 +1908,7 @@
               <w:rPr>
                 <w:sz w:val="18"/>
               </w:rPr>
-              <w:t>Cacique Guaymallén canal bridge (metrotranvía / San Martín, E–W)</w:t>
+              <w:t>Cacique Guaymallén canal bridge (metrotranvía / San Martín)</w:t>
             </w:r>
           </w:p>
         </w:tc>
@@ -2174,7 +1950,7 @@
               <w:rPr>
                 <w:sz w:val="18"/>
               </w:rPr>
-              <w:t>Med–high (drainage + transit)</w:t>
+              <w:t>Med-high (drainage + transit)</w:t>
             </w:r>
           </w:p>
         </w:tc>
@@ -2276,7 +2052,7 @@
               <w:rPr>
                 <w:sz w:val="18"/>
               </w:rPr>
-              <w:t>Saenz Peña–La Carrodilla / Ruta 15 centrality</w:t>
+              <w:t>Saenz Peña-La Carrodilla / Ruta 15 centrality</w:t>
             </w:r>
           </w:p>
         </w:tc>
@@ -2348,7 +2124,7 @@
               <w:rPr>
                 <w:sz w:val="18"/>
               </w:rPr>
-              <w:t>Microplazas (≈10 of 20)</w:t>
+              <w:t>Microplazas (~10 of 20)</w:t>
             </w:r>
           </w:p>
         </w:tc>
@@ -2636,7 +2412,7 @@
               <w:rPr>
                 <w:sz w:val="18"/>
               </w:rPr>
-              <w:t>Sidewalks Zapiola &amp; Pueyrredón (1,750 m)</w:t>
+              <w:t>Sidewalks Zapiola &amp; Pueyrredón</w:t>
             </w:r>
           </w:p>
         </w:tc>
@@ -2708,7 +2484,7 @@
               <w:rPr>
                 <w:sz w:val="18"/>
               </w:rPr>
-              <w:t>Boulevard Tierra del Fuego (400 m)</w:t>
+              <w:t>Boulevard Tierra del Fuego</w:t>
             </w:r>
           </w:p>
         </w:tc>
@@ -2750,7 +2526,7 @@
               <w:rPr>
                 <w:sz w:val="18"/>
               </w:rPr>
-              <w:t>Med–high (green corridor)</w:t>
+              <w:t>Med-high (green corridor)</w:t>
             </w:r>
           </w:p>
         </w:tc>
@@ -2780,7 +2556,7 @@
               <w:rPr>
                 <w:sz w:val="18"/>
               </w:rPr>
-              <w:t>Polideportivo sidewalk (600 m)</w:t>
+              <w:t>Polideportivo sidewalk</w:t>
             </w:r>
           </w:p>
         </w:tc>
@@ -2879,76 +2655,6 @@
               <w:rPr>
                 <w:sz w:val="18"/>
               </w:rPr>
-            </w:r>
-          </w:p>
-        </w:tc>
-        <w:tc>
-          <w:tcPr>
-            <w:tcW w:type="dxa" w:w="1728"/>
-          </w:tcPr>
-          <w:p>
-            <w:r/>
-            <w:r>
-              <w:rPr>
-                <w:sz w:val="18"/>
-              </w:rPr>
-            </w:r>
-          </w:p>
-        </w:tc>
-      </w:tr>
-      <w:tr>
-        <w:tc>
-          <w:tcPr>
-            <w:tcW w:type="dxa" w:w="1728"/>
-          </w:tcPr>
-          <w:p>
-            <w:r/>
-            <w:r>
-              <w:rPr>
-                <w:sz w:val="18"/>
-              </w:rPr>
-            </w:r>
-          </w:p>
-        </w:tc>
-        <w:tc>
-          <w:tcPr>
-            <w:tcW w:type="dxa" w:w="1728"/>
-          </w:tcPr>
-          <w:p>
-            <w:r/>
-            <w:r>
-              <w:rPr>
-                <w:sz w:val="18"/>
-              </w:rPr>
-              <w:t>Adaptation-relevant (high / med–high impact)</w:t>
-            </w:r>
-          </w:p>
-        </w:tc>
-        <w:tc>
-          <w:tcPr>
-            <w:tcW w:type="dxa" w:w="1728"/>
-          </w:tcPr>
-          <w:p>
-            <w:r/>
-            <w:r>
-              <w:rPr>
-                <w:sz w:val="18"/>
-              </w:rPr>
-              <w:t>4,724,570,000</w:t>
-            </w:r>
-          </w:p>
-        </w:tc>
-        <w:tc>
-          <w:tcPr>
-            <w:tcW w:type="dxa" w:w="1728"/>
-          </w:tcPr>
-          <w:p>
-            <w:r/>
-            <w:r>
-              <w:rPr>
-                <w:sz w:val="18"/>
-              </w:rPr>
-              <w:t>≈69%</w:t>
             </w:r>
           </w:p>
         </w:tc>
@@ -3045,7 +2751,7 @@
           <w:i/>
           <w:sz w:val="18"/>
         </w:rPr>
-        <w:t>Table 4: The municipally funded 2026 public-works programme—the betterment-levy base—by planning priority and environmental-adaptation impact. Seven further projects (bike lanes, repaving) sit in the operating budget. Source: Plan de Obras, “Obras y Espacios Públicos — Proyectos a ejecutar 2026.”</w:t>
+        <w:t>Table 4. The municipally funded 2026 public-works programme—the betterment-levy base—by planning priority (EA) and environmental-adaptation impact. Source: Plan de Obras 2026. EA, escenario/planning-priority weight.</w:t>
       </w:r>
     </w:p>
     <w:p>
@@ -3053,7 +2759,7 @@
         <w:spacing w:after="120" w:line="276" w:lineRule="auto"/>
       </w:pPr>
       <w:r>
-        <w:t>Some works are the province’s, not the city’s—chiefly a new Río Mendoza bridge and two Acceso Sur pedestrian overpasses (Table 5). The municipality cannot levy betterment on works it does not finance, so these are excluded from the base; we list them because they reshape corridor accessibility and the land-value gradient the other instruments tax.</w:t>
+        <w:t>A separate set of works is financed or executed by the Province of Mendoza, not the municipality (Table 5). The municipality cannot levy betterment on works it does not finance, so these are excluded from the base; we report them because they reshape corridor accessibility and the land-value gradient the other instruments tax.</w:t>
       </w:r>
     </w:p>
     <w:tbl>
@@ -3125,7 +2831,7 @@
                 <w:b/>
                 <w:sz w:val="18"/>
               </w:rPr>
-              <w:t>Env.–adaptation impact</w:t>
+              <w:t>Env.-adaptation impact</w:t>
             </w:r>
           </w:p>
         </w:tc>
@@ -3213,7 +2919,7 @@
               <w:rPr>
                 <w:sz w:val="18"/>
               </w:rPr>
-              <w:t>Pedestrian overpass — Acceso Sur &amp; Malabia</w:t>
+              <w:t>Pedestrian overpass - Acceso Sur &amp; Malabia</w:t>
             </w:r>
           </w:p>
         </w:tc>
@@ -3241,7 +2947,7 @@
               <w:rPr>
                 <w:sz w:val="18"/>
               </w:rPr>
-              <w:t>Low–medium (safe crossing)</w:t>
+              <w:t>Low-medium (safe crossing)</w:t>
             </w:r>
           </w:p>
         </w:tc>
@@ -3271,7 +2977,7 @@
               <w:rPr>
                 <w:sz w:val="18"/>
               </w:rPr>
-              <w:t>Pedestrian overpass — Acceso Sur &amp; Castro Barros</w:t>
+              <w:t>Pedestrian overpass - Acceso Sur &amp; Castro Barros</w:t>
             </w:r>
           </w:p>
         </w:tc>
@@ -3299,7 +3005,7 @@
               <w:rPr>
                 <w:sz w:val="18"/>
               </w:rPr>
-              <w:t>Low–medium (safe crossing)</w:t>
+              <w:t>Low-medium (safe crossing)</w:t>
             </w:r>
           </w:p>
         </w:tc>
@@ -3314,7 +3020,7 @@
           <w:i/>
           <w:sz w:val="18"/>
         </w:rPr>
-        <w:t>Table 5: Works financed or executed by the Province of Mendoza—excluded from the municipal betterment base.</w:t>
+        <w:t>Table 5. Works financed or executed by the Province of Mendoza, excluded from the municipal betterment base. DPV, Dirección Provincial de Vialidad.</w:t>
       </w:r>
     </w:p>
     <w:p>
@@ -3322,7 +3028,7 @@
         <w:spacing w:after="120" w:line="276" w:lineRule="auto"/>
       </w:pPr>
       <w:r>
-        <w:t>The development-rights and differential-rent instruments are aimed at the places the city means to densify (Table 6): the metrotranvía / San Martín transit corridor and the centralities of Ciudad de Luján and La Carrodilla–Mayor Drummond, which coincide with the priority urban voids carrying the 200-percent vacant-land surcharge. The same places where idle land is most penalised are where building rights are sold and rezoning value captured—one spatial signal, not three.</w:t>
+        <w:t>The development-rights and rent-capture instruments are aimed at the densification zones—the metrotranvía/San Martín transit corridor and the Ciudad de Luján and La Carrodilla-Mayor Drummond centralities, which coincide with the priority urban voids carrying the 200-percent surcharge (Table 6). The same places where idle land is most penalised are where building rights are sold and rezoning value captured—one spatial signal, not three.</w:t>
       </w:r>
     </w:p>
     <w:tbl>
@@ -3452,7 +3158,7 @@
               <w:rPr>
                 <w:sz w:val="18"/>
               </w:rPr>
-              <w:t>TOD; low-carbon mobility (ID 1274)</w:t>
+              <w:t>TOD; low-carbon mobility</w:t>
             </w:r>
           </w:p>
         </w:tc>
@@ -3510,7 +3216,7 @@
               <w:rPr>
                 <w:sz w:val="18"/>
               </w:rPr>
-              <w:t>Compact infill; drainage (ID 395)</w:t>
+              <w:t>Compact infill; drainage</w:t>
             </w:r>
           </w:p>
         </w:tc>
@@ -3526,7 +3232,7 @@
               <w:rPr>
                 <w:sz w:val="18"/>
               </w:rPr>
-              <w:t>La Carrodilla–Mayor Drummond</w:t>
+              <w:t>La Carrodilla-Mayor Drummond</w:t>
             </w:r>
           </w:p>
         </w:tc>
@@ -3568,7 +3274,7 @@
               <w:rPr>
                 <w:sz w:val="18"/>
               </w:rPr>
-              <w:t>Centrality (ID 773); urban voids</w:t>
+              <w:t>Centrality; urban voids</w:t>
             </w:r>
           </w:p>
         </w:tc>
@@ -3583,7 +3289,7 @@
           <w:i/>
           <w:sz w:val="18"/>
         </w:rPr>
-        <w:t>Table 6: Priority densification zones where the development-rights and differential-rent instruments apply.</w:t>
+        <w:t>Table 6. Priority densification zones where the development-rights and differential-rent instruments apply. PVA, Participación en la Valoración de Activos (differential rent capture); TOD, transit-oriented development.</w:t>
       </w:r>
     </w:p>
     <w:p>
@@ -3591,7 +3297,7 @@
         <w:spacing w:after="120" w:line="276" w:lineRule="auto"/>
       </w:pPr>
       <w:r>
-        <w:t>What gives these instruments their base is the city’s new buildability code. The draft COS 2026 replaces a single height limit with two lines: a base of 10 metres (13 in ZCM6), buildable without instruments, and a maximum of 36 metres reached only by purchasing additional building rights (Suelo Creado) or through rent capture—about 8.7 extra floors. Across the seven affected zones (4,491 hectares, with floor-area coverage of 75–90 percent), this opens a ceiling near 295 million m² of additional buildable area (Table 7), a theoretical maximum that assumes full take-up. Revenue therefore depends on annual absorption, which we set conservatively at 20,000–80,000 m²/yr across the Low–High scenarios—under 0.03 percent of the ceiling even at the high end, so the development-rights base will not bind for decades.</w:t>
+        <w:t>Their base is set by the new buildability code (Table 7). The draft COS 2026 replaces a single height limit with two lines: a base of 10 metres (13 in zone ZCM6), buildable without instruments, and a maximum of 36 metres reached only by purchasing additional building rights—about 8.7 extra floors. Across the seven affected zones (4,491 hectares, with floor-area coverage of 75-90 percent), this opens a theoretical ceiling near 295 million m2 of additional buildable area; because that ceiling assumes full take-up, revenue depends on annual absorption, which we set conservatively at 20,000-80,000 m2/yr—under 0.03 percent of the ceiling even at the high end, so the base will not bind for decades.</w:t>
       </w:r>
     </w:p>
     <w:tbl>
@@ -3664,7 +3370,7 @@
                 <w:b/>
                 <w:sz w:val="18"/>
               </w:rPr>
-              <w:t>Height básico → máximo (m)</w:t>
+              <w:t>Height base -&gt; max (m)</w:t>
             </w:r>
           </w:p>
         </w:tc>
@@ -3679,7 +3385,7 @@
                 <w:b/>
                 <w:sz w:val="18"/>
               </w:rPr>
-              <w:t>Additional buildable ceiling (m²)</w:t>
+              <w:t>Additional buildable ceiling (m2)</w:t>
             </w:r>
           </w:p>
         </w:tc>
@@ -3737,7 +3443,7 @@
               <w:rPr>
                 <w:sz w:val="18"/>
               </w:rPr>
-              <w:t>10 → 36</w:t>
+              <w:t>10 -&gt; 36</w:t>
             </w:r>
           </w:p>
         </w:tc>
@@ -3809,7 +3515,7 @@
               <w:rPr>
                 <w:sz w:val="18"/>
               </w:rPr>
-              <w:t>10 → 36</w:t>
+              <w:t>10 -&gt; 36</w:t>
             </w:r>
           </w:p>
         </w:tc>
@@ -3881,7 +3587,7 @@
               <w:rPr>
                 <w:sz w:val="18"/>
               </w:rPr>
-              <w:t>10 → 36</w:t>
+              <w:t>10 -&gt; 36</w:t>
             </w:r>
           </w:p>
         </w:tc>
@@ -3953,7 +3659,7 @@
               <w:rPr>
                 <w:sz w:val="18"/>
               </w:rPr>
-              <w:t>10 → 36</w:t>
+              <w:t>10 -&gt; 36</w:t>
             </w:r>
           </w:p>
         </w:tc>
@@ -4025,7 +3731,7 @@
               <w:rPr>
                 <w:sz w:val="18"/>
               </w:rPr>
-              <w:t>10 → 36</w:t>
+              <w:t>10 -&gt; 36</w:t>
             </w:r>
           </w:p>
         </w:tc>
@@ -4097,7 +3803,7 @@
               <w:rPr>
                 <w:sz w:val="18"/>
               </w:rPr>
-              <w:t>10 → 36</w:t>
+              <w:t>10 -&gt; 36</w:t>
             </w:r>
           </w:p>
         </w:tc>
@@ -4155,7 +3861,7 @@
               <w:rPr>
                 <w:sz w:val="18"/>
               </w:rPr>
-              <w:t>—</w:t>
+              <w:t>-</w:t>
             </w:r>
           </w:p>
         </w:tc>
@@ -4169,7 +3875,7 @@
               <w:rPr>
                 <w:sz w:val="18"/>
               </w:rPr>
-              <w:t>13 → 36</w:t>
+              <w:t>13 -&gt; 36</w:t>
             </w:r>
           </w:p>
         </w:tc>
@@ -4227,7 +3933,7 @@
               <w:rPr>
                 <w:sz w:val="18"/>
               </w:rPr>
-              <w:t>—</w:t>
+              <w:t>-</w:t>
             </w:r>
           </w:p>
         </w:tc>
@@ -4241,7 +3947,7 @@
               <w:rPr>
                 <w:sz w:val="18"/>
               </w:rPr>
-              <w:t>—</w:t>
+              <w:t>-</w:t>
             </w:r>
           </w:p>
         </w:tc>
@@ -4270,7 +3976,7 @@
           <w:i/>
           <w:sz w:val="18"/>
         </w:rPr>
-        <w:t>Table 7: COS 2026 buildability schedule and the ceiling of additional buildable area. Base 10 m → maximum 36 m (~8.7 extra floors) reachable only via Suelo Creado and rent capture; the ceiling assumes full take-up and is an upper bound, not an annual figure. Source: draft COS 2026 (Tabla 10) and the 2019–2026 zoning comparison.</w:t>
+        <w:t>Table 7. COS 2026 buildability schedule and the resulting ceiling of additional buildable area. The ceiling assumes full take-up and is an upper bound, not an annual figure. Source: draft COS 2026 (Tabla 10) and the 2019-2026 zoning comparison. FOS, Factor de Ocupación del Suelo (floor-area coverage).</w:t>
       </w:r>
     </w:p>
     <w:p>
@@ -4278,7 +3984,7 @@
         <w:spacing w:after="120" w:line="276" w:lineRule="auto"/>
       </w:pPr>
       <w:r>
-        <w:t>Valuing this take-up closes the estimate. Floor space sells for roughly USD 300–1,200/m² in these zones (built-value map), of which the instruments capture a small fraction—Suelo Creado at about 50–250 UT/m² and rent capture at 30–180 UT/m². Adding the three designed instruments to the two operational ones, the package’s combined annual potential runs from about USD 1.8 million (Low) to USD 5.6 million (High), centred near USD 3.0 million (Table 8)—of which roughly USD 1 million is already collected. These are deliberately conservative figures tied to current parameters; because the rights ceiling is so large, they are best read as a near-term floor that rises with take-up, not as a cap.</w:t>
+        <w:t>Valuing this take-up closes the estimate. Floor space sells for roughly USD 300-1,200/m2 in these zones (built-value map), of which the instruments capture a small fraction—Suelo Creado at about 50-250 UT/m2 and rent capture at 30-180 UT/m2. Adding the three designed instruments to the two operational ones, the package’s combined annual potential runs from about USD 1.8 million (Low) to USD 5.6 million (High), centred near USD 3.0 million (Table 8)—of which roughly USD 1 million is already collected. These are deliberately conservative figures tied to current parameters; because the rights ceiling is so large, they are best read as a near-term floor that rises with take-up, not a cap.</w:t>
       </w:r>
     </w:p>
     <w:tbl>
@@ -4396,7 +4102,7 @@
               <w:rPr>
                 <w:sz w:val="18"/>
               </w:rPr>
-              <w:t>2026 works programme: ARS 3.49 B eligible × 25–50%</w:t>
+              <w:t>2026 works programme: ARS 3.49 B eligible x 25-50%</w:t>
             </w:r>
           </w:p>
         </w:tc>
@@ -4468,7 +4174,7 @@
               <w:rPr>
                 <w:sz w:val="18"/>
               </w:rPr>
-              <w:t>COS 2026 take-up × 50–250 UT/m²</w:t>
+              <w:t>COS 2026 take-up x 50-250 UT/m2</w:t>
             </w:r>
           </w:p>
         </w:tc>
@@ -4540,7 +4246,7 @@
               <w:rPr>
                 <w:sz w:val="18"/>
               </w:rPr>
-              <w:t>COS 2026 take-up × 30–180 UT/m²</w:t>
+              <w:t>COS 2026 take-up x 30-180 UT/m2</w:t>
             </w:r>
           </w:p>
         </w:tc>
@@ -4598,7 +4304,7 @@
               <w:rPr>
                 <w:sz w:val="18"/>
               </w:rPr>
-              <w:t>Subtotal — value capture (ex-ante)</w:t>
+              <w:t>Subtotal - value capture (ex-ante)</w:t>
             </w:r>
           </w:p>
         </w:tc>
@@ -4811,7 +4517,23 @@
           <w:i/>
           <w:sz w:val="18"/>
         </w:rPr>
-        <w:t>Table 8: Revenue potential by instrument and scenario—a deterministic build-up from real parameters (ordinance formulas, UT 2026 = ARS 235; converted at ARS 1,244.17/USD). Ex-ante figures are illustrative and conservative, tied to current take-up; all figures are before leverage.</w:t>
+        <w:t>Table 8. Revenue potential by instrument and scenario—a deterministic build-up from real parameters (ordinance formulas; UT 2026 = ARS 235; converted at ARS 1,244.17/USD). Ex-ante figures are illustrative and conservative; all figures are before leverage.</w:t>
+      </w:r>
+    </w:p>
+    <w:p>
+      <w:pPr>
+        <w:spacing w:after="120" w:line="276" w:lineRule="auto"/>
+      </w:pPr>
+      <w:r>
+        <w:t>The estimate is deliberately robust to its most uncertain input. Even if annual take-up of building rights were half the baseline, the package would still clear roughly USD 2 million a year; and because the rights ceiling exceeds any plausible absorption by orders of magnitude, the binding constraint on development-rights revenue is market demand, not regulatory supply. The betterment line, anchored in a budgeted works programme rather than a forecast, is the most secure; the rent-capture line, which depends on the pace of rezoning, is the most variable. Reporting a Low-Base-High band rather than a single number is meant to make these dependencies visible, not to hide them.</w:t>
+      </w:r>
+    </w:p>
+    <w:p>
+      <w:pPr>
+        <w:spacing w:after="120" w:line="276" w:lineRule="auto"/>
+      </w:pPr>
+      <w:r>
+        <w:t>Set against the municipal fisc, the magnitude is material rather than token. For a city of about 175,000 residents, a recurring USD 3 million of adaptation-earmarked own-source revenue is the seed an external financier needs to see, not the whole tree. Its significance lies less in the absolute figure than in three properties: it is local, so it is not hostage to national transfers; it is predictable and ring-fenced, so it can be pledged; and it grows with the city, since the same development pressure that drives adaptation costs also drives the revenue that funds the response. Those properties, more than the point estimate, are what make the package bankable.</w:t>
       </w:r>
     </w:p>
     <w:p>
@@ -4819,7 +4541,7 @@
         <w:pStyle w:val="Heading2"/>
       </w:pPr>
       <w:r>
-        <w:t>7.4 Incidence: who pays, who benefits</w:t>
+        <w:t>Incidence: who pays, who benefits</w:t>
       </w:r>
     </w:p>
     <w:p>
@@ -4827,7 +4549,15 @@
         <w:spacing w:after="120" w:line="276" w:lineRule="auto"/>
       </w:pPr>
       <w:r>
-        <w:t>Because the journal rightly worries that climate finance can deepen inequity, incidence is not an afterthought here but a design variable. On the paying side, the instruments fall on the owners who capture the windfall: rezoning-gain capture and development-rights sales are paid by those who profit from intensification, and the vacant-land surcharge falls on owners holding serviced land idle—progressive bases, since landownership and development gains are concentrated. On the receiving side, the priority index binds disbursement to need, steering investment toward districts with lower baseline access to green space, water, and services (Section 7.5). The combination is deliberately redistributive: value is captured where it is created—the consolidated, high-value, transit-served districts—and spent where the deficits are deepest. A framework that merely raised revenue could still be regressive; this one is engineered not to be.</w:t>
+        <w:t>Because climate finance can deepen inequity, incidence is a design variable here, not an afterthought. On the paying side, the instruments fall on the owners who capture the windfall: rezoning-gain capture and development-rights sales are paid by those who profit from intensification, and the vacant-land surcharge falls on owners holding serviced land idle—progressive bases, since landownership and development gains are concentrated. On the receiving side, the priority index binds disbursement to need, steering investment toward districts with lower baseline access to green space, water, and services. The combination is deliberately redistributive: value is captured where it is created—the consolidated, high-value, transit-served districts—and spent where deficits are deepest. A framework that merely raised revenue could still be regressive; this one is engineered not to be.</w:t>
+      </w:r>
+    </w:p>
+    <w:p>
+      <w:pPr>
+        <w:spacing w:after="120" w:line="276" w:lineRule="auto"/>
+      </w:pPr>
+      <w:r>
+        <w:t>Two caveats keep the incidence claim honest. First, betterment and development charges can be partly shifted into house prices; the progressivity we claim is of the statutory base, and net incidence depends on local supply elasticities, which the city should monitor as the market responds. Second, an idle-land surcharge can press on asset-rich but cash-poor owners—elderly smallholders on the urban edge, for instance—so the ordinance’s instalment options and hardship provisions are part of the equity design, not administrative afterthoughts. Equity lives in the detail of who is charged and how, as much as in where the money is spent.</w:t>
       </w:r>
     </w:p>
     <w:p>
@@ -4835,7 +4565,7 @@
         <w:pStyle w:val="Heading2"/>
       </w:pPr>
       <w:r>
-        <w:t>7.5 The financing gap, alignment, and the leverage that closes it</w:t>
+        <w:t>The financing gap, alignment, and leverage</w:t>
       </w:r>
     </w:p>
     <w:p>
@@ -4843,7 +4573,7 @@
         <w:spacing w:after="120" w:line="276" w:lineRule="auto"/>
       </w:pPr>
       <w:r>
-        <w:t>To make the numbers concrete, take one deficit the index measures. Lifting green space from a municipal average near 6 m² per inhabitant to the index’s 10 m² target implies roughly 700,000 m² of new green space for about 175,000 residents; at an indicative USD 80/m², a one-off capital need near USD 56 million. Near-term revenue of about USD 3 million covers some 5 percent of that in a year on a pay-as-you-go basis—which is why pay-as-you-go is the wrong frame. The trust fund’s leverage (Section 5.5) is what closes the gap: a dedicated reserve to match grants, and a pledged revenue stream to secure a green bond of three to four times annual revenue—about USD 9–12 million at the baseline, and more as the package matures—covering a large share of the deficit in a single issuance.</w:t>
+        <w:t>To make the numbers concrete, take one deficit the index measures. Lifting green space from a municipal average near 6 m2 per inhabitant to the index’s 10 m2 target implies roughly 700,000 m2 of new green space for about 175,000 residents; at an indicative USD 80/m2, a one-off capital need near USD 56 million. Near-term revenue of about USD 3 million covers some 5 percent of that in a year on a pay-as-you-go basis—which is why pay-as-you-go is the wrong frame. The trust fund’s leverage is what closes the gap: a dedicated reserve to match grants and a pledged stream to secure a green bond of three to four times annual revenue (about USD 9-12 million at the baseline, and more as the package matures), covering a large share of the deficit in a single issuance.</w:t>
       </w:r>
     </w:p>
     <w:p>
@@ -4851,7 +4581,7 @@
         <w:spacing w:after="120" w:line="276" w:lineRule="auto"/>
       </w:pPr>
       <w:r>
-        <w:t>Does the city already invest where the index says it should? The green-space dimension, computed in October 2025, puts the highest-priority districts at the urban edge and the lower-income periphery—Vistalba, Las Compuertas, and the Industrial district at level E, then Chacras de Coria, Agrelo, Mayor Drummond, and Vertientes del Pedemonte at level D—while the consolidated centres of Ciudad and La Puntilla already score A (Table 9). The need is not where the city is wealthiest.</w:t>
+        <w:t>Does the city already invest where the index says it should? The green-space dimension, computed in October 2025, puts the highest-priority districts at the urban edge and the lower-income periphery—Vistalba, Las Compuertas, and the Industrial district at level E, then Chacras de Coria, Agrelo, Mayor Drummond, and Vertientes del Pedemonte at level D—while the consolidated centres of Ciudad and La Puntilla already score A (Table 9). Mapping the 2026 works onto these grades exposes a partial misalignment (Table 10 and Figure 1): the two largest place-based investments—the Ciudad and La Carrodilla centralities, ARS 1.5 billion each—fall in districts already graded A and B, while the highest-priority districts receive no dedicated green investment. The swing factor is the microplazas programme (ARS 1.2 billion, about twenty squares, not yet sited): directing those squares to the level-D and level-E districts would turn a latent misalignment into a close fit between the index and the investment—precisely the disbursement discipline the incidence argument requires.</w:t>
       </w:r>
     </w:p>
     <w:tbl>
@@ -4923,7 +4653,7 @@
               <w:rPr>
                 <w:sz w:val="18"/>
               </w:rPr>
-              <w:t>A — Outstanding (≥90%)</w:t>
+              <w:t>A - Outstanding (&gt;=90%)</w:t>
             </w:r>
           </w:p>
         </w:tc>
@@ -4967,7 +4697,7 @@
               <w:rPr>
                 <w:sz w:val="18"/>
               </w:rPr>
-              <w:t>B — Very sufficient (70–89%)</w:t>
+              <w:t>B - Very sufficient (70-89%)</w:t>
             </w:r>
           </w:p>
         </w:tc>
@@ -5011,7 +4741,7 @@
               <w:rPr>
                 <w:sz w:val="18"/>
               </w:rPr>
-              <w:t>C — Sufficient (50–69%)</w:t>
+              <w:t>C - Sufficient (50-69%)</w:t>
             </w:r>
           </w:p>
         </w:tc>
@@ -5055,7 +4785,7 @@
               <w:rPr>
                 <w:sz w:val="18"/>
               </w:rPr>
-              <w:t>D — Insufficient (25–49%)</w:t>
+              <w:t>D - Insufficient (25-49%)</w:t>
             </w:r>
           </w:p>
         </w:tc>
@@ -5099,7 +4829,7 @@
               <w:rPr>
                 <w:sz w:val="18"/>
               </w:rPr>
-              <w:t>E — Very insufficient (&lt;25%)</w:t>
+              <w:t>E - Very insufficient (&lt;25%)</w:t>
             </w:r>
           </w:p>
         </w:tc>
@@ -5142,15 +4872,7 @@
           <w:i/>
           <w:sz w:val="18"/>
         </w:rPr>
-        <w:t>Table 9: Green-space and biodiversity subindex by district (October 2025). Lower sufficiency = higher priority. Source: Laboratorio de Políticas Públicas, Municipalidad de Luján de Cuyo.</w:t>
-      </w:r>
-    </w:p>
-    <w:p>
-      <w:pPr>
-        <w:spacing w:after="120" w:line="276" w:lineRule="auto"/>
-      </w:pPr>
-      <w:r>
-        <w:t>Mapping the 2026 works onto these grades exposes a partial misalignment (Table 10 and Figure 1). The two largest place-based investments—the Ciudad and La Carrodilla centralities, ARS 1.5 billion each—fall in districts already graded A and B; their case rests on compactness, drainage, and value capture, not green-space equity. Mayor Drummond, a level-D district, does get a sidewalk and is a densification target, which fits. But the highest-priority districts—Vistalba, Las Compuertas, Industrial—get no dedicated green investment. The swing factor is the microplazas programme: ARS 1.2 billion, about twenty squares, department-wide and not yet sited. Direct those squares to the level-D and level-E districts and a latent misalignment becomes a close fit between the index and the investment—precisely the disbursement discipline the incidence argument requires.</w:t>
+        <w:t>Table 9. Green-space and biodiversity subindex by district (October 2025). Lower sufficiency = higher priority. Source: Laboratorio de Políticas Públicas, Municipalidad de Luján de Cuyo.</w:t>
       </w:r>
     </w:p>
     <w:tbl>
@@ -5280,7 +5002,7 @@
               <w:rPr>
                 <w:sz w:val="18"/>
               </w:rPr>
-              <w:t>Low — justified by drainage/compactness</w:t>
+              <w:t>Low - justified by drainage/compactness</w:t>
             </w:r>
           </w:p>
         </w:tc>
@@ -5338,7 +5060,7 @@
               <w:rPr>
                 <w:sz w:val="18"/>
               </w:rPr>
-              <w:t>Low — justified by value capture</w:t>
+              <w:t>Low - justified by value capture</w:t>
             </w:r>
           </w:p>
         </w:tc>
@@ -5396,7 +5118,7 @@
               <w:rPr>
                 <w:sz w:val="18"/>
               </w:rPr>
-              <w:t>Decisive — align by targeting D/E districts</w:t>
+              <w:t>Decisive - align by targeting D/E districts</w:t>
             </w:r>
           </w:p>
         </w:tc>
@@ -5440,7 +5162,7 @@
               <w:rPr>
                 <w:sz w:val="18"/>
               </w:rPr>
-              <w:t>D–E (edge)</w:t>
+              <w:t>D-E (edge)</w:t>
             </w:r>
           </w:p>
         </w:tc>
@@ -5454,7 +5176,7 @@
               <w:rPr>
                 <w:sz w:val="18"/>
               </w:rPr>
-              <w:t>Potential — near high-priority area</w:t>
+              <w:t>Potential - near high-priority area</w:t>
             </w:r>
           </w:p>
         </w:tc>
@@ -5513,64 +5235,6 @@
                 <w:sz w:val="18"/>
               </w:rPr>
               <w:t>Aligned</w:t>
-            </w:r>
-          </w:p>
-        </w:tc>
-      </w:tr>
-      <w:tr>
-        <w:tc>
-          <w:tcPr>
-            <w:tcW w:type="dxa" w:w="2160"/>
-          </w:tcPr>
-          <w:p>
-            <w:r/>
-            <w:r>
-              <w:rPr>
-                <w:sz w:val="18"/>
-              </w:rPr>
-              <w:t>Polideportivo sidewalk (463)</w:t>
-            </w:r>
-          </w:p>
-        </w:tc>
-        <w:tc>
-          <w:tcPr>
-            <w:tcW w:type="dxa" w:w="2160"/>
-          </w:tcPr>
-          <w:p>
-            <w:r/>
-            <w:r>
-              <w:rPr>
-                <w:sz w:val="18"/>
-              </w:rPr>
-              <w:t>Ciudad</w:t>
-            </w:r>
-          </w:p>
-        </w:tc>
-        <w:tc>
-          <w:tcPr>
-            <w:tcW w:type="dxa" w:w="2160"/>
-          </w:tcPr>
-          <w:p>
-            <w:r/>
-            <w:r>
-              <w:rPr>
-                <w:sz w:val="18"/>
-              </w:rPr>
-              <w:t>A</w:t>
-            </w:r>
-          </w:p>
-        </w:tc>
-        <w:tc>
-          <w:tcPr>
-            <w:tcW w:type="dxa" w:w="2160"/>
-          </w:tcPr>
-          <w:p>
-            <w:r/>
-            <w:r>
-              <w:rPr>
-                <w:sz w:val="18"/>
-              </w:rPr>
-              <w:t>Low</w:t>
             </w:r>
           </w:p>
         </w:tc>
@@ -5643,7 +5307,7 @@
           <w:i/>
           <w:sz w:val="18"/>
         </w:rPr>
-        <w:t>Table 10: 2026 works mapped to district green-space priority. “Alignment” asks whether the work sits where the index signals the greatest need.</w:t>
+        <w:t>Table 10. 2026 works mapped to district green-space priority. "Alignment" asks whether the work sits where the index signals the greatest need.</w:t>
       </w:r>
     </w:p>
     <w:p>
@@ -5694,7 +5358,15 @@
           <w:i/>
           <w:sz w:val="18"/>
         </w:rPr>
-        <w:t>Figure 1: Where green investment is needed versus where the 2026 works are located. Horizontal axis: district green-space sufficiency (A–E; lower = higher priority). Vertical axis: 2026 place-based public-space investment (ARS billion). Ciudad and Carrodilla concentrate spending in already well-served districts; the highest-need districts receive little or none; the department-wide microplazas line is the lever that could close the gap. Source: author, from the priority index (Oct 2025) and the 2026 Plan de Obras.</w:t>
+        <w:t>Figure 1. Where green investment is needed versus where the 2026 works are located: district green-space sufficiency (A-E) against 2026 place-based public-space investment (ARS billion). Source: author, from the priority index (Oct 2025) and the 2026 Plan de Obras.</w:t>
+      </w:r>
+    </w:p>
+    <w:p>
+      <w:pPr>
+        <w:pStyle w:val="Heading1"/>
+      </w:pPr>
+      <w:r>
+        <w:t>Conclusion</w:t>
       </w:r>
     </w:p>
     <w:p>
@@ -5702,7 +5374,39 @@
         <w:spacing w:after="120" w:line="276" w:lineRule="auto"/>
       </w:pPr>
       <w:r>
-        <w:t>The exercise exposes the framework’s central tension, and its resolution. Value capture is generated where land is most valuable—the consolidated, transit-served districts that are also the densification zones—yet several of those same districts score poorly on green space, and the equity dimension will likely flag the poorer periphery as most deprived. A city that simply spent each instrument’s proceeds where they arose would entrench that gap. The trust fund is what prevents it: it captures value where value is created and, through the index, redirects it to where need is greatest. Pairing the fund with the index does double duty—it satisfies the financier’s demand for evidence-based prioritisation, and it disciplines the regressive instinct to invest only in neighbourhoods that already have enough.</w:t>
+        <w:t>The exercise above exposes the framework’s central tension and its resolution. Value capture is generated where land is most valuable—the consolidated, transit-served districts that are also the densification zones—yet several of those districts score poorly on green space, and the equity dimension will likely flag the poorer periphery as most deprived. A city that spent each instrument’s proceeds where they arose would entrench that gap; the trust fund, paired with the index, is what prevents it, capturing value where it is created and redirecting it to where need is greatest. This does double duty: it satisfies the financier’s demand for evidence-based prioritisation and disciplines the regressive instinct to invest only where revenue is raised.</w:t>
+      </w:r>
+    </w:p>
+    <w:p>
+      <w:pPr>
+        <w:spacing w:after="120" w:line="276" w:lineRule="auto"/>
+      </w:pPr>
+      <w:r>
+        <w:t>These results speak to three literatures at once. For land value capture, they extend instruments designed for transit-oriented development and infrastructure cost recovery into climate adaptation, and document them in an intermediate rather than a metropolitan setting. For climate-adaptation finance, they answer the bankability diagnosis with a concrete revenue mechanism and show how a trust fund converts own-source revenue into counterpart funding and repayment capacity. For the water-and-cities literature, they move the empirical centre of gravity from coastal flooding toward slow-onset water scarcity, where the capitalisation logic—binding hydrological limits on developable land—is, if anything, stronger. The contribution is to join these threads in a single, operating case rather than to advance any one in isolation.</w:t>
+      </w:r>
+    </w:p>
+    <w:p>
+      <w:pPr>
+        <w:spacing w:after="120" w:line="276" w:lineRule="auto"/>
+      </w:pPr>
+      <w:r>
+        <w:t>The framework is built to travel. It is modular—a city can start with the two instruments easiest to administer and add the rest as capacity grows; adaptable—the index reweights to different hazards; and leverage-ready wherever international finance asks for own-source matching and repayment. Its hardest barrier is political economy: LVC moves wealth from landowners to the community and provokes resistance. The workable response, evident in Luján de Cuyo, is to frame the instruments as climate-adaptation finance rather than taxation and to let the earmarking and transparency of the trust fund do the persuading—when residents see a rezoning charge become a plaza or a recharged aquifer in their own district, the politics shift. For financiers, an instrument that manufactures counterpart funds, repayment capacity, and spatial evidence in one structure is the municipal counterpart that turns a thin pipeline thick.</w:t>
+      </w:r>
+    </w:p>
+    <w:p>
+      <w:pPr>
+        <w:spacing w:after="120" w:line="276" w:lineRule="auto"/>
+      </w:pPr>
+      <w:r>
+        <w:t>Two conditions make the model portable, and both are within reach. The first is legal authority to levy the instruments and to earmark their proceeds—available here through municipal competence over zoning and local charges, though it varies across jurisdictions and should be secured before instruments are designed. The second is land-market data, and the requirement is modest: a GIS-based valuation system with land-, built-, and assessment-value layers, the tax roll, an itemised works programme, a buildability code, and district indicators computed one dimension at a time. The Luján de Cuyo experience is that a city can begin before the dataset is complete—two instruments are already collecting while several index dimensions are still being assembled—so partial data is no excuse to wait.</w:t>
+      </w:r>
+    </w:p>
+    <w:p>
+      <w:pPr>
+        <w:spacing w:after="120" w:line="276" w:lineRule="auto"/>
+      </w:pPr>
+      <w:r>
+        <w:t>Three limitations bound the contribution. The value-capture instruments are designed, not yet transacting, so their figures are conservative estimates anchored to real parameters rather than observed flows; the priority index is one dimension into a six-dimension build; and the full leverage chain awaits the bond market. Future work should track take-up once the instruments are sanctioned, complete the index, and document the first leverage transaction. None of this weakens the central claim: Luján de Cuyo has built a machine other cities can build too—one that converts the land-use windfall, which water-stressed regions are generating in abundance, into bankable, equitably allocated own-source revenue. A just transition is measured not by the size of the cheque but by where it lands; an intermediate city that can capture and steer its own land value is one that can finally make the cheque land at home.</w:t>
       </w:r>
     </w:p>
     <w:p>
@@ -5710,15 +5414,7 @@
         <w:pStyle w:val="Heading1"/>
       </w:pPr>
       <w:r>
-        <w:t>8. Transferability and Policy Implications</w:t>
-      </w:r>
-    </w:p>
-    <w:p>
-      <w:pPr>
-        <w:pStyle w:val="Heading2"/>
-      </w:pPr>
-      <w:r>
-        <w:t>8.1 What travels</w:t>
+        <w:t>Acknowledgements</w:t>
       </w:r>
     </w:p>
     <w:p>
@@ -5726,87 +5422,63 @@
         <w:spacing w:after="120" w:line="276" w:lineRule="auto"/>
       </w:pPr>
       <w:r>
-        <w:t>The framework was built to be copied, and three features make it portable. It is modular: a city can start with the two instruments easiest to administer—a vacant-land surcharge and a development charge, both operational in Luján de Cuyo within a few years—and add the value-capture instruments as capacity grows. It is adaptable: the priority index accommodates different hazards by reweighting dimensions, so a flood- or heat-exposed city can keep the architecture and change the content. And it is leverage-ready: the trust-fund logic works wherever international finance asks for own-source matching and repayment, which is to say almost everywhere.</w:t>
+        <w:t>The author thanks the Municipality of Luján de Cuyo and its Laboratorio de Políticas Públicas for access to municipal data, and colleagues at CIPUV–Universidad Torcuato Di Tella for comments. All errors are the author’s own.</w:t>
       </w:r>
     </w:p>
     <w:p>
       <w:pPr>
-        <w:pStyle w:val="Heading2"/>
+        <w:spacing w:after="120"/>
       </w:pPr>
       <w:r>
-        <w:t>8.2 Enabling conditions and barriers</w:t>
+        <w:rPr>
+          <w:b/>
+        </w:rPr>
+        <w:t xml:space="preserve">Funding. </w:t>
+      </w:r>
+      <w:r>
+        <w:t>This research forms part of a 12-month case study supported by the Lincoln Institute of Land Policy.</w:t>
       </w:r>
     </w:p>
     <w:p>
       <w:pPr>
-        <w:spacing w:after="120" w:line="276" w:lineRule="auto"/>
+        <w:spacing w:after="120"/>
       </w:pPr>
       <w:r>
-        <w:t>Two conditions are necessary. The first is legal authority to levy the instruments—available here through municipal competence over zoning and local charges, but variable across jurisdictions. The second is land-market data; the Luján de Cuyo experience suggests that GIS-based valuation plus periodic market surveys is enough, and is affordable. The hardest barrier is political economy: land value capture moves wealth from landowners to the community and provokes predictable resistance. The case suggests a workable response—frame the instruments as climate-adaptation finance rather than as taxation, and let the earmarking and transparency of the trust fund do the persuading. When residents see that the charge on a rezoning becomes a plaza or a recharged aquifer in their own district, the politics shift.</w:t>
+        <w:rPr>
+          <w:b/>
+        </w:rPr>
+        <w:t xml:space="preserve">Author Contributions. </w:t>
+      </w:r>
+      <w:r>
+        <w:t>Conceptualization, Methodology, Investigation, Formal analysis, Data curation, Writing – Original Draft, and Writing – Review &amp; Editing: C Goytia (sole author).</w:t>
       </w:r>
     </w:p>
     <w:p>
       <w:pPr>
-        <w:pStyle w:val="Heading2"/>
+        <w:spacing w:after="120"/>
       </w:pPr>
       <w:r>
-        <w:t>8.3 Implications for cities and their financiers</w:t>
+        <w:rPr>
+          <w:b/>
+        </w:rPr>
+        <w:t xml:space="preserve">Conflict of Interest. </w:t>
+      </w:r>
+      <w:r>
+        <w:t>The author declares no competing interests.</w:t>
       </w:r>
     </w:p>
     <w:p>
       <w:pPr>
-        <w:spacing w:after="120" w:line="276" w:lineRule="auto"/>
+        <w:spacing w:after="120"/>
       </w:pPr>
       <w:r>
-        <w:t>For mayors, the message is that the adaptation-finance wait can end at the municipal boundary. Cities need not wait for a national programme or a multilateral cheque to begin; they can mobilise the land value their own decisions create, ring-fence it, and use it as the lever that eventually attracts the larger flows. This is the agenda C40 and the Cities Climate Finance Leadership Alliance have pressed (C40 Cities &amp; GCoM, 2026; CCFLA, 2024)—own-source revenue, creditworthiness, bankable pipelines, inclusive allocation—rendered as a concrete, replicable mechanism for the intermediate cities that need it most and study it least. For financiers, the implication is symmetric: an instrument that manufactures counterpart funds, repayment capacity, and spatial evidence in one structure is precisely the municipal counterpart that turns a thin pipeline thick. A just transition, after all, is measured not by the size of the cheque but by where it lands; an intermediate city that can capture and steer its own land value is one that can finally make the cheque land at home.</w:t>
+        <w:rPr>
+          <w:b/>
+        </w:rPr>
+        <w:t xml:space="preserve">Data Accessibility. </w:t>
       </w:r>
-    </w:p>
-    <w:p>
-      <w:pPr>
-        <w:pStyle w:val="Heading1"/>
-      </w:pPr>
       <w:r>
-        <w:t>9. Conclusion</w:t>
-      </w:r>
-    </w:p>
-    <w:p>
-      <w:pPr>
-        <w:spacing w:after="120" w:line="276" w:lineRule="auto"/>
-      </w:pPr>
-      <w:r>
-        <w:t>The alignment between land value capture and climate adaptation has been recognised in the literature for years and implemented almost nowhere. Luján de Cuyo shows what implementation looks like in an intermediate, water-stressed, Majority-World city: six instruments that catch the increment across the development cycle; a fideicomiso that pools them into matched, repayable revenue; and a priority index that points the money toward need. The evidence is partly already in the bank—an elevenfold real rise in one operational charge, a surcharge on more than five thousand idle lots—and partly ahead of it, in instruments calibrated to a real works programme and a real buildability code, whose combined potential we estimate conservatively at USD 1.8–5.6 million a year (central ≈ USD 3 million), before leverage.</w:t>
-      </w:r>
-    </w:p>
-    <w:p>
-      <w:pPr>
-        <w:spacing w:after="120" w:line="276" w:lineRule="auto"/>
-      </w:pPr>
-      <w:r>
-        <w:t>The honest limitations are the obverse of the contribution. The value-capture instruments are designed, not yet transacting, so their figures are estimates anchored to real parameters rather than observed flows; the priority index is one dimension into a six-dimension build; and the full leverage chain remains to be tested in the bond market. None of this weakens the central claim. The claim is not that Luján de Cuyo has solved adaptation finance, but that it has built a machine other cities can build too—one that converts the land-use windfall, which water-stressed regions are generating in abundance, into the bankable, equitably allocated own-source revenue the climate-finance system rewards.</w:t>
-      </w:r>
-    </w:p>
-    <w:p>
-      <w:pPr>
-        <w:spacing w:after="120" w:line="276" w:lineRule="auto"/>
-      </w:pPr>
-      <w:r>
-        <w:t>Two and a half billion people live in water-stressed countries, and the cities among them will not be saved by templates designed for somewhere else. They need models that begin with what they have. The land beneath a growing city rises in value every day; the only questions are who captures the increment, and what they do with it. Luján de Cuyo offers one answer—capture it, ring-fence it, and spend it where the city most needs to adapt—and an institutional architecture, refined in the friction of municipal politics, for any city ready to give the same answer.</w:t>
-      </w:r>
-    </w:p>
-    <w:p>
-      <w:pPr>
-        <w:pStyle w:val="Heading1"/>
-      </w:pPr>
-      <w:r>
-        <w:t>Acknowledgments</w:t>
-      </w:r>
-    </w:p>
-    <w:p>
-      <w:pPr>
-        <w:spacing w:after="120" w:line="276" w:lineRule="auto"/>
-      </w:pPr>
-      <w:r>
-        <w:t>This research forms part of a 12-month case study supported by the Lincoln Institute of Land Policy (LILP). The author thanks the Municipality of Luján de Cuyo and its Laboratorio de Políticas Públicas for access to municipal data, and CIPUV–Universidad Torcuato Di Tella for institutional support. All errors are the author’s own.</w:t>
+        <w:t>Aggregated municipal data and the calculations underlying the estimates are available from the author on reasonable request; the underlying records are held by the Municipality of Luján de Cuyo.</w:t>
       </w:r>
     </w:p>
     <w:p>
@@ -5826,7 +5498,7 @@
         <w:rPr>
           <w:sz w:val="18"/>
         </w:rPr>
-        <w:t>Alterman, R. (2012). Land use regulations and property values: The “Windfall Capture” idea revisited. In N. Brooks, K. Donaghy, &amp; G. Knaap (Eds.), The Oxford Handbook of Urban Economics and Planning (pp. 755–786). Oxford University Press.</w:t>
+        <w:t>Alterman, R. (2012). Land use regulations and property values: The “windfall capture” idea revisited. In N. Brooks, K. Donaghy, &amp; G. Knaap (Eds.), The Oxford handbook of urban economics and planning (pp. 755–786). Oxford University Press.</w:t>
       </w:r>
     </w:p>
     <w:p>
@@ -5838,7 +5510,7 @@
         <w:rPr>
           <w:sz w:val="18"/>
         </w:rPr>
-        <w:t>Blanco, A., Moreno, N., Vetter, D., &amp; Vetter, M. (2016). The Potential of Land Value Capture for Financing Urban Projects. Inter-American Development Bank.</w:t>
+        <w:t>Blanco, A., Moreno, N., Vetter, D., &amp; Vetter, M. (2016). The potential of land value capture for financing urban projects. Inter-American Development Bank.</w:t>
       </w:r>
     </w:p>
     <w:p>
@@ -5850,7 +5522,7 @@
         <w:rPr>
           <w:sz w:val="18"/>
         </w:rPr>
-        <w:t>C40 Cities &amp; Global Covenant of Mayors for Climate &amp; Energy (GCoM). (2026). Building the Financial Case for Urban Adaptation: Guidance and Case Studies. C40 Cities Finance Facility.</w:t>
+        <w:t>C40 Cities, &amp; Global Covenant of Mayors for Climate &amp; Energy. (2026). Building the financial case for urban adaptation: Guidance and case studies. C40 Cities Finance Facility.</w:t>
       </w:r>
     </w:p>
     <w:p>
@@ -5862,7 +5534,7 @@
         <w:rPr>
           <w:sz w:val="18"/>
         </w:rPr>
-        <w:t>Cities Climate Finance Leadership Alliance (CCFLA) &amp; Climate Policy Initiative. (2024). The State of Cities Climate Finance 2024. CCFLA.</w:t>
+        <w:t>Cities Climate Finance Leadership Alliance, &amp; Climate Policy Initiative. (2024). The state of cities climate finance 2024. CCFLA.</w:t>
       </w:r>
     </w:p>
     <w:p>
@@ -5874,7 +5546,7 @@
         <w:rPr>
           <w:sz w:val="18"/>
         </w:rPr>
-        <w:t>Clifton, J., Díaz-Fuentes, D., Fernández Gutiérrez, M., &amp; Lara Gómez, A. (2025). European Investment Bank climate finance and regional vulnerability in the just transition. Cambridge Journal of Regions, Economy and Society (advance online publication). [Exact title to be confirmed.]</w:t>
+        <w:t>Clifton, J., Díaz-Fuentes, D., Fernández Gutiérrez, M., &amp; Lara Gómez, A. (2025). European Investment Bank climate finance and regional vulnerability in the just transition. Cambridge Journal of Regions, Economy and Society. Advance online publication. [Exact title to be confirmed.]</w:t>
       </w:r>
     </w:p>
     <w:p>
@@ -5886,7 +5558,7 @@
         <w:rPr>
           <w:sz w:val="18"/>
         </w:rPr>
-        <w:t>Coalition for Urban Transitions. (2019). Climate Emergency, Urban Opportunity. WRI Ross Center &amp; C40 Cities.</w:t>
+        <w:t>Coalition for Urban Transitions. (2019). Climate emergency, urban opportunity. WRI Ross Center &amp; C40 Cities.</w:t>
       </w:r>
     </w:p>
     <w:p>
@@ -5898,7 +5570,7 @@
         <w:rPr>
           <w:sz w:val="18"/>
         </w:rPr>
-        <w:t>Dunning, R. J., &amp; Lord, A. (2020). Preparing for the climate crisis: What role should land value capture play? Land Use Policy, 99, 104867.</w:t>
+        <w:t>Dunning, R. J., &amp; Lord, A. (2020). Preparing for the climate crisis: What role should land value capture play? Land Use Policy, 99, 104867. https://doi.org/10.1016/j.landusepol.2020.104867</w:t>
       </w:r>
     </w:p>
     <w:p>
@@ -5910,7 +5582,7 @@
         <w:rPr>
           <w:sz w:val="18"/>
         </w:rPr>
-        <w:t>Duranton, G., &amp; Puga, D. (2015). Urban land use. In G. Duranton, J. V. Henderson, &amp; W. Strange (Eds.), Handbook of Regional and Urban Economics, Vol. 5 (pp. 467–560). Elsevier.</w:t>
+        <w:t>Duranton, G., &amp; Puga, D. (2015). Urban land use. In G. Duranton, J. V. Henderson, &amp; W. Strange (Eds.), Handbook of regional and urban economics (Vol. 5, pp. 467–560). Elsevier.</w:t>
       </w:r>
     </w:p>
     <w:p>
@@ -5922,7 +5594,7 @@
         <w:rPr>
           <w:sz w:val="18"/>
         </w:rPr>
-        <w:t>Fankhauser, S., &amp; Schmidt-Traub, G. (2011). From adaptation to climate-resilient development. Climate and Development, 3(2), 94–113.</w:t>
+        <w:t>George, H. (1879). Progress and poverty. Appleton.</w:t>
       </w:r>
     </w:p>
     <w:p>
@@ -5934,7 +5606,7 @@
         <w:rPr>
           <w:sz w:val="18"/>
         </w:rPr>
-        <w:t>George, H. (1879). Progress and Poverty. Appleton.</w:t>
+        <w:t>Glaeser, E. (2011). Triumph of the city. Penguin Press.</w:t>
       </w:r>
     </w:p>
     <w:p>
@@ -5946,7 +5618,7 @@
         <w:rPr>
           <w:sz w:val="18"/>
         </w:rPr>
-        <w:t>Glaeser, E. (2011). Triumph of the City. Penguin Press.</w:t>
+        <w:t>Global Commission on Adaptation. (2019). Adapt now: A global call for leadership on climate resilience. Global Center on Adaptation &amp; World Resources Institute.</w:t>
       </w:r>
     </w:p>
     <w:p>
@@ -5958,7 +5630,7 @@
         <w:rPr>
           <w:sz w:val="18"/>
         </w:rPr>
-        <w:t>Global Commission on Adaptation. (2019). Adapt Now: A Global Call for Leadership on Climate Resilience.</w:t>
+        <w:t>OECD, &amp; Lincoln Institute of Land Policy. (2022). Global compendium of land value capture policies. OECD Publishing.</w:t>
       </w:r>
     </w:p>
     <w:p>
@@ -5970,7 +5642,7 @@
         <w:rPr>
           <w:sz w:val="18"/>
         </w:rPr>
-        <w:t>Ingram, G. K., &amp; Hong, Y. H. (Eds.). (2012). Value Capture and Land Policies. Lincoln Institute of Land Policy.</w:t>
+        <w:t>Smolka, M. O. (2013). Implementing value capture in Latin America: Policies and tools for urban development. Lincoln Institute of Land Policy.</w:t>
       </w:r>
     </w:p>
     <w:p>
@@ -5982,7 +5654,7 @@
         <w:rPr>
           <w:sz w:val="18"/>
         </w:rPr>
-        <w:t>IPCC. (2022). Climate Change 2022: Impacts, Adaptation and Vulnerability. Cambridge University Press.</w:t>
+        <w:t>Suzuki, H., Murakami, J., Hong, Y. H., &amp; Tamayose, B. (2015). Financing transit-oriented development with land values. World Bank Group.</w:t>
       </w:r>
     </w:p>
     <w:p>
@@ -5994,79 +5666,23 @@
         <w:rPr>
           <w:sz w:val="18"/>
         </w:rPr>
-        <w:t>Maldonado, M. M. (2013). Land value capture in Colombia. In M. M. Smolka &amp; D. Amborski (Eds.), Recuperación de Plusvalías en América Latina. Lincoln Institute.</w:t>
+        <w:t>United Nations Environment Programme. (2023). Adaptation gap report 2023: Underfinanced. Underprepared. UNEP.</w:t>
       </w:r>
     </w:p>
     <w:p>
       <w:pPr>
-        <w:spacing w:after="80"/>
-        <w:ind w:left="432" w:hanging="432"/>
+        <w:pStyle w:val="Heading1"/>
       </w:pPr>
       <w:r>
-        <w:rPr>
-          <w:sz w:val="18"/>
-        </w:rPr>
-        <w:t>OECD &amp; Lincoln Institute of Land Policy. (2022). Global Compendium of Land Value Capture Policies. OECD Publishing.</w:t>
+        <w:t>Figure captions</w:t>
       </w:r>
     </w:p>
     <w:p>
       <w:pPr>
-        <w:spacing w:after="80"/>
-        <w:ind w:left="432" w:hanging="432"/>
+        <w:spacing w:after="120" w:line="276" w:lineRule="auto"/>
       </w:pPr>
       <w:r>
-        <w:rPr>
-          <w:sz w:val="18"/>
-        </w:rPr>
-        <w:t>Smolka, M. O. (2013). Implementing Value Capture in Latin America. Lincoln Institute of Land Policy.</w:t>
-      </w:r>
-    </w:p>
-    <w:p>
-      <w:pPr>
-        <w:spacing w:after="80"/>
-        <w:ind w:left="432" w:hanging="432"/>
-      </w:pPr>
-      <w:r>
-        <w:rPr>
-          <w:sz w:val="18"/>
-        </w:rPr>
-        <w:t>Suzuki, H., Murakami, J., Hong, Y. H., &amp; Tamayose, B. (2015). Financing Transit-Oriented Development with Land Values. World Bank Group.</w:t>
-      </w:r>
-    </w:p>
-    <w:p>
-      <w:pPr>
-        <w:spacing w:after="80"/>
-        <w:ind w:left="432" w:hanging="432"/>
-      </w:pPr>
-      <w:r>
-        <w:rPr>
-          <w:sz w:val="18"/>
-        </w:rPr>
-        <w:t>UNEP. (2023). Adaptation Gap Report 2023: Underfinanced. Underprepared. United Nations Environment Programme.</w:t>
-      </w:r>
-    </w:p>
-    <w:p>
-      <w:pPr>
-        <w:spacing w:after="80"/>
-        <w:ind w:left="432" w:hanging="432"/>
-      </w:pPr>
-      <w:r>
-        <w:rPr>
-          <w:sz w:val="18"/>
-        </w:rPr>
-        <w:t>United Nations. (2023). The United Nations World Water Development Report 2023. UNESCO.</w:t>
-      </w:r>
-    </w:p>
-    <w:p>
-      <w:pPr>
-        <w:spacing w:after="80"/>
-        <w:ind w:left="432" w:hanging="432"/>
-      </w:pPr>
-      <w:r>
-        <w:rPr>
-          <w:sz w:val="18"/>
-        </w:rPr>
-        <w:t>World Bank. (2021). What the Future Has in Store: A New Paradigm for Water Storage. World Bank Publications.</w:t>
+        <w:t>Figure 1. Where green investment is needed versus where the 2026 works are located: district green-space sufficiency (A–E; lower = higher priority) against 2026 place-based public-space investment (ARS billion).</w:t>
       </w:r>
     </w:p>
     <w:sectPr>

</xml_diff>

<commit_message>
Sharpen the structured abstract for submission (248 words)
Stronger Background/Methods/Results/Conclusions abstract: leads on the
capability-not-need finance bias (Clifton et al.), the LVC-climate-finance gap
(Dunning & Lord) and the water-scarce Majority-World gap; foregrounds the
operational realized evidence (5,315 idle lots; water/sewer 11x), the
USD 1.8-5.6M package with ~USD 1M already collected, leverage, and incidence;
closes on the bankability-bridge framing. 248 words (<=250).
</commit_message>
<xml_diff>
--- a/paper/LVC_Climate_Adaptation_Paper_FINAL_JCCPE.docx
+++ b/paper/LVC_Climate_Adaptation_Paper_FINAL_JCCPE.docx
@@ -182,7 +182,7 @@
         <w:t xml:space="preserve">Background. </w:t>
       </w:r>
       <w:r>
-        <w:t>Municipalities are on the front line of climate action but lack the financial tools, autonomy, and access to capital to deliver it, and the finance that does flow favours cities already able to compete, not those most exposed (Clifton et al., 2025). Land value capture (LVC) has developed apart from climate finance (Dunning and Lord, 2020), and its climate applications cluster in coastal-flooding settings; evidence from water-scarce, Majority-World cities is scarce.</w:t>
+        <w:t>Municipalities lead climate action but lack the financial tools, autonomy, and access to capital to deliver it—and the finance that does flow follows institutional capability, not exposure, favouring large metropolises over the intermediate cities most at risk (Clifton et al., 2025). Land value capture (LVC) has evolved apart from climate finance (Dunning and Lord, 2020), and its few climate applications cluster in coastal-flooding contexts, leaving water-scarce Majority-World cities undocumented.</w:t>
       </w:r>
     </w:p>
     <w:p>
@@ -196,7 +196,7 @@
         <w:t xml:space="preserve">Methods. </w:t>
       </w:r>
       <w:r>
-        <w:t>We present a single-case study of Luján de Cuyo (Mendoza, Argentina; ~175,000 residents), which is legislating a coordinated six-instrument LVC package, ring-fenced in a municipal Trust Fund (Fideicomiso) and allocated by a district-level Sustainable Urbanism Priority Index. We separate realized revenue (municipal records, 2021–2026) from deterministic ex ante estimates calibrated to the city’s 2026 public-works programme, its buildability code, and land- and built-value maps, and we analyse incidence—who pays, who benefits.</w:t>
+        <w:t>We present a single-case study of Luján de Cuyo (Mendoza, Argentina; ~175,000 residents), a semi-arid city legislating a coordinated six-instrument LVC package, ring-fenced in a municipal trust fund (Fideicomiso) and allocated by a district-level Sustainable Urbanism Priority Index. Drawing on municipal collection records, the 2026 public-works programme, the buildability code, and land- and built-value maps, we separate realized revenue from deterministic ex ante estimates and analyse incidence—who pays, who benefits.</w:t>
       </w:r>
     </w:p>
     <w:p>
@@ -210,7 +210,7 @@
         <w:t xml:space="preserve">Results. </w:t>
       </w:r>
       <w:r>
-        <w:t>Two instruments already operate: a surcharge on 5,315 idle parcels and a water-and-sewer charge whose real collections rose elevenfold in 2021–2025. The full package could raise USD 1.8–5.6 million per year (central ≈ USD 3 million), before leverage, with roughly USD 1 million already collected. Binding disbursement to the index directs investment to districts with least green space, water, and services, guarding against regressive outcomes.</w:t>
+        <w:t>Two instruments already operate: a surcharge on 5,315 idle parcels and a water-and-sewer charge whose real collections rose elevenfold in 2021–2025. The full package could raise USD 1.8–5.6 million per year (central ≈ USD 3 million) before leverage, with roughly USD 1 million already collected; ring-fenced, the stream anchors grant-matching and green-bond repayment. Binding disbursement to the index steers investment toward districts with least green space, water, and services, guarding against regressive outcomes.</w:t>
       </w:r>
     </w:p>
     <w:p>
@@ -224,7 +224,7 @@
         <w:t xml:space="preserve">Conclusions. </w:t>
       </w:r>
       <w:r>
-        <w:t>A ring-fenced, indicator-governed LVC trust fund is a bankability bridge: a replicable template that turns the land-use windfall into matched, repayable adaptation finance for water-stressed Majority-World cities.</w:t>
+        <w:t>A ring-fenced, indicator-governed LVC trust fund is a bankability bridge: it turns the land-use windfall into matched, repayable, and equitably allocated adaptation finance, and offers a replicable template for water-stressed Majority-World cities.</w:t>
       </w:r>
     </w:p>
     <w:p>

</xml_diff>

<commit_message>
Apply dual-reviewer (Duranton / C40) fixes to the submission
Original Research:
- Low-carbon co-benefits thread (Background, Summary, abstract, keywords) to fit
  the call's 'equitable, resilient AND low-carbon' scope.
- Robustness on the elevenfold realized rise: official vs parallel FX note and a
  price-vs-quantity decomposition; explicit take-up sensitivity figures.
- Incidence strengthened: equity-and-community dimension directs funds to the
  most deprived districts; final incidence by supply elasticity.
- Claims softened (revenue capacity, not welfare/BCR); replicable-universe and
  C40/ICLEI diffusion sentence added.
- Main text 5,494 words; abstract 247; summary 181.
Policy Guidelines: low-carbon dividend sentence added (2,539 words).
</commit_message>
<xml_diff>
--- a/paper/LVC_Climate_Adaptation_Paper_FINAL_JCCPE.docx
+++ b/paper/LVC_Climate_Adaptation_Paper_FINAL_JCCPE.docx
@@ -224,7 +224,7 @@
         <w:t xml:space="preserve">Conclusions. </w:t>
       </w:r>
       <w:r>
-        <w:t>A ring-fenced, indicator-governed LVC trust fund is a bankability bridge: it turns the land-use windfall into matched, repayable, and equitably allocated adaptation finance, and offers a replicable template for water-stressed Majority-World cities.</w:t>
+        <w:t>A ring-fenced, indicator-governed LVC trust fund is a bankability bridge: it turns the land-use windfall into matched, repayable, equitably allocated adaptation finance with low-carbon co-benefits—a replicable template for water-stressed Majority-World cities.</w:t>
       </w:r>
     </w:p>
     <w:p>
@@ -235,7 +235,7 @@
         <w:t xml:space="preserve">Keywords: </w:t>
       </w:r>
       <w:r>
-        <w:t>land value capture; climate adaptation finance; municipal trust funds; water scarcity; Majority-World cities; incidence and equity; Argentina</w:t>
+        <w:t>land value capture; climate adaptation finance; municipal trust funds; water scarcity; low-carbon co-benefits; Majority-World cities; incidence and equity; Argentina</w:t>
       </w:r>
     </w:p>
     <w:p>
@@ -297,6 +297,15 @@
         <w:spacing w:after="40"/>
       </w:pPr>
       <w:r>
+        <w:t>The compact, transit-oriented growth the instruments reward also cuts emissions, so adaptation finance and low-carbon development advance with the same lever.</w:t>
+      </w:r>
+    </w:p>
+    <w:p>
+      <w:pPr>
+        <w:pStyle w:val="ListBullet"/>
+        <w:spacing w:after="40"/>
+      </w:pPr>
+      <w:r>
         <w:t>In Luján de Cuyo two instruments already collect about USD 1 million a year; the full package could raise USD 1.8–5.6 million a year before leverage.</w:t>
       </w:r>
     </w:p>
@@ -346,6 +355,14 @@
       </w:pPr>
       <w:r>
         <w:t>In a water-stressed region the windfall and the damage are joined at the hip. In Luján de Cuyo a hectare of vineyard rezoned for subdivision can multiply in value several-fold; the same conversion seals a permeable surface, removes a recharge area, swaps irrigation demand for higher-per-capita domestic demand, and erases a carbon sink. Private gain and collective cost are produced by one and the same act. We call this the water–land value paradox: development capitalises a premium that depends on water security while undermining the water security on which the premium depends. The paradox is also the opportunity—capturing a slice of the development-generated increment to finance water and green infrastructure closes the loop between the activity that creates the adaptation cost and the instrument that pays for the response.</w:t>
+      </w:r>
+    </w:p>
+    <w:p>
+      <w:pPr>
+        <w:spacing w:after="120" w:line="276" w:lineRule="auto"/>
+      </w:pPr>
+      <w:r>
+        <w:t>Crucially, the same design that finances adaptation also lowers emissions—which matters for a special issue concerned with low-carbon as well as resilient futures. The instruments reward compact, transit-oriented growth: the development-rights and rezoning charges are concentrated on the metrotranvía corridor and the urban centralities, while the vacant-land surcharge pushes infill rather than sprawl. Denser, transit-served development cuts vehicle travel and per-capita energy and water use, and it spares the agricultural and piedmont land whose conversion would otherwise release soil carbon and erase recharge. Adaptation finance and mitigation, in this design, are the same lever pulled once.</w:t>
       </w:r>
     </w:p>
     <w:p>
@@ -1775,6 +1792,14 @@
       </w:pPr>
       <w:r>
         <w:t>The eleven-fold rise is not an accounting artefact: it survives deflation by the consumer-price index and conversion at the official exchange rate, so it reflects real growth in the charge’s purchasing power, not merely peso inflation. Three forces drive it—sustained development pressure on the irrigated periphery, an instrument base indexed to keep pace with prices, and steady improvement in billing and collection. The lesson for other cities is that a land-linked charge, properly indexed and administered, can become a material revenue line within a single mandate, even amid extreme macroeconomic volatility; the framework’s feasibility is demonstrated, not merely projected.</w:t>
+      </w:r>
+    </w:p>
+    <w:p>
+      <w:pPr>
+        <w:spacing w:after="120" w:line="276" w:lineRule="auto"/>
+      </w:pPr>
+      <w:r>
+        <w:t>Two robustness notes are warranted. First, the series is reported both in constant 2025 pesos and in US dollars at the official exchange rate; valued at the parallel rate the dollar levels would be lower, but the real growth—measured in pesos before conversion—would be similar, so the elevenfold rise reflects purchasing power rather than an exchange-rate artefact. Second, the increase is quantity as well as price: the charge’s unit base is indexed, but the number of chargeable connections rose with the development pressure documented above, so the trend is not a mere tariff revaluation. The point is not the exact multiple but the direction and durability: a land-linked own-source charge grew in real terms through extreme macroeconomic turbulence.</w:t>
       </w:r>
     </w:p>
     <w:p>
@@ -4525,7 +4550,7 @@
         <w:spacing w:after="120" w:line="276" w:lineRule="auto"/>
       </w:pPr>
       <w:r>
-        <w:t>The estimate is deliberately robust to its most uncertain input. Even if annual take-up of building rights were half the baseline, the package would still clear roughly USD 2 million a year; and because the rights ceiling exceeds any plausible absorption by orders of magnitude, the binding constraint on development-rights revenue is market demand, not regulatory supply. The betterment line, anchored in a budgeted works programme rather than a forecast, is the most secure; the rent-capture line, which depends on the pace of rezoning, is the most variable. Reporting a Low-Base-High band rather than a single number is meant to make these dependencies visible, not to hide them.</w:t>
+        <w:t>The estimate is deliberately robust to its most uncertain input. Even if annual take-up of building rights were half the baseline, the package would still clear roughly USD 2 million a year once betterment and operational revenue are counted; the two buildability instruments together yield about USD 0.15, 0.95, and 3.25 million at take-up of 20,000, 50,000, and 80,000 m²/yr, respectively. Because the rights ceiling exceeds any plausible absorption by orders of magnitude, the binding constraint on development-rights revenue is market demand, not regulatory supply. The betterment line, anchored in a budgeted works programme rather than a forecast, is the most secure; the rent-capture line, which depends on the pace of rezoning, is the most variable. Reporting a Low-Base-High band rather than a single number is meant to make these dependencies visible, not to hide them.</w:t>
       </w:r>
     </w:p>
     <w:p>
@@ -4549,7 +4574,7 @@
         <w:spacing w:after="120" w:line="276" w:lineRule="auto"/>
       </w:pPr>
       <w:r>
-        <w:t>Because climate finance can deepen inequity, incidence is a design variable here, not an afterthought. On the paying side, the instruments fall on the owners who capture the windfall: rezoning-gain capture and development-rights sales are paid by those who profit from intensification, and the vacant-land surcharge falls on owners holding serviced land idle—progressive bases, since landownership and development gains are concentrated. On the receiving side, the priority index binds disbursement to need, steering investment toward districts with lower baseline access to green space, water, and services. The combination is deliberately redistributive: value is captured where it is created—the consolidated, high-value, transit-served districts—and spent where deficits are deepest. A framework that merely raised revenue could still be regressive; this one is engineered not to be.</w:t>
+        <w:t>Because climate finance can deepen inequity, incidence is a design variable here, not an afterthought. On the paying side, the instruments fall on the owners who capture the windfall: rezoning-gain capture and development-rights sales are paid by those who profit from intensification, and the vacant-land surcharge falls on owners holding serviced land idle—progressive bases, since landownership and development gains are concentrated. On the receiving side, the priority index binds disbursement to need, steering investment toward districts with lower baseline access to green space, water, and services. The combination is deliberately redistributive: value is captured where it is created—the consolidated, high-value, transit-served districts—and spent where deficits are deepest. A framework that merely raised revenue could still be regressive; this one is engineered not to be. And because the index carries an equity-and-community dimension—overcrowding and material deprivation—alongside the green-space dimension computed so far, the disbursement rule is built to favour the most deprived districts, not only the greenest-deficient, extending the redistributive logic as the remaining dimensions come online. Where the final incidence falls depends on local supply elasticities: where developable land is inelastic, as binding water limits make it here, the charge rests on the landowner rather than the buyer, which is precisely the progressive case.</w:t>
       </w:r>
     </w:p>
     <w:p>
@@ -5390,7 +5415,7 @@
         <w:spacing w:after="120" w:line="276" w:lineRule="auto"/>
       </w:pPr>
       <w:r>
-        <w:t>The framework is built to travel. It is modular—a city can start with the two instruments easiest to administer and add the rest as capacity grows; adaptable—the index reweights to different hazards; and leverage-ready wherever international finance asks for own-source matching and repayment. Its hardest barrier is political economy: LVC moves wealth from landowners to the community and provokes resistance. The workable response, evident in Luján de Cuyo, is to frame the instruments as climate-adaptation finance rather than taxation and to let the earmarking and transparency of the trust fund do the persuading—when residents see a rezoning charge become a plaza or a recharged aquifer in their own district, the politics shift. For financiers, an instrument that manufactures counterpart funds, repayment capacity, and spatial evidence in one structure is the municipal counterpart that turns a thin pipeline thick.</w:t>
+        <w:t>The framework is built to travel. It is modular—a city can start with the two instruments easiest to administer and add the rest as capacity grows; adaptable—the index reweights to different hazards; and leverage-ready wherever international finance asks for own-source matching and repayment. Its hardest barrier is political economy: LVC moves wealth from landowners to the community and provokes resistance. The workable response, evident in Luján de Cuyo, is to frame the instruments as climate-adaptation finance rather than taxation and to let the earmarking and transparency of the trust fund do the persuading—when residents see a rezoning charge become a plaza or a recharged aquifer in their own district, the politics shift. For financiers, an instrument that manufactures counterpart funds, repayment capacity, and spatial evidence in one structure is the municipal counterpart that turns a thin pipeline thick. The template is most directly relevant to the world’s intermediate cities in semi-arid, water-stressed regions—numerous across Latin America, the Mediterranean, the Middle East, South Asia, and the western United States—where the same development pressure that drives adaptation costs also generates the land value that can pay for them; networks such as C40 and ICLEI are natural channels for its diffusion.</w:t>
       </w:r>
     </w:p>
     <w:p>
@@ -5406,7 +5431,7 @@
         <w:spacing w:after="120" w:line="276" w:lineRule="auto"/>
       </w:pPr>
       <w:r>
-        <w:t>Three limitations bound the contribution. The value-capture instruments are designed, not yet transacting, so their figures are conservative estimates anchored to real parameters rather than observed flows; the priority index is one dimension into a six-dimension build; and the full leverage chain awaits the bond market. Future work should track take-up once the instruments are sanctioned, complete the index, and document the first leverage transaction. None of this weakens the central claim: Luján de Cuyo has built a machine other cities can build too—one that converts the land-use windfall, which water-stressed regions are generating in abundance, into bankable, equitably allocated own-source revenue. A just transition is measured not by the size of the cheque but by where it lands; an intermediate city that can capture and steer its own land value is one that can finally make the cheque land at home.</w:t>
+        <w:t>Three limitations bound the contribution. The value-capture instruments are designed, not yet transacting, so their figures are conservative estimates anchored to real parameters rather than observed flows; the priority index is one dimension into a six-dimension build; and the full leverage chain awaits the bond market. We estimate revenue capacity and its allocation, not the net welfare or benefit–cost of the investments it would fund; the adaptation returns we invoke are drawn from the literature, and measuring them locally remains for future work. Future work should track take-up once the instruments are sanctioned, complete the index, and document the first leverage transaction. None of this weakens the central claim: Luján de Cuyo has built a machine other cities can build too—one that converts the land-use windfall, which water-stressed regions are generating in abundance, into bankable, equitably allocated own-source revenue. A just transition is measured not by the size of the cheque but by where it lands; an intermediate city that can capture and steer its own land value is one that can finally make the cheque land at home.</w:t>
       </w:r>
     </w:p>
     <w:p>

</xml_diff>

<commit_message>
Add 30-min class deck (PPTX) and run a de-duplication/tightening pass
- New: Lujan_de_Cuyo_Gestion_Suelo_Clase.pptx (28 slides, Spanish) for a 30-min
  class on Lujan de Cuyo's land-management innovation: context, the water-land
  paradox, LVC, the six instruments one by one (flagging the two operational),
  the Fideicomiso, the leverage ladder, the Indice de Ciudad Deseada, real
  numbers, alignment figure, equity, low-carbon co-benefits, lessons, and
  discussion prompts; with speaker notes and timings.
- Manuscript de-duplication (round-2 review): merged five redundant pairs
  (literature; elevenfold robustness; single-case justification; incidence/
  elasticity; transferability), softened 'more representative' to 'understudied',
  trimmed the Conclusion to three paragraphs. Main text 5,066 words (within
  5,000-7,500); abstract (247) and Summary for Policymakers (181) unchanged.
</commit_message>
<xml_diff>
--- a/paper/LVC_Climate_Adaptation_Paper_FINAL_JCCPE.docx
+++ b/paper/LVC_Climate_Adaptation_Paper_FINAL_JCCPE.docx
@@ -378,15 +378,7 @@
         <w:spacing w:after="120" w:line="276" w:lineRule="auto"/>
       </w:pPr>
       <w:r>
-        <w:t>Land value capture recovers for the public some of the land-value increment created by public investment, regulation, or growth. Latin America has experimented with it for the better part of a century, from Colombia’s contribución de valorización to São Paulo’s auctioned building-rights certificates (CEPACs) and Brazil’s 2001 City Statute, and the toolkit is now well catalogued (Smolka, 2013; OECD &amp; Lincoln Institute, 2022). The recurring lesson is that the gap is not legal authorisation but execution: weak valuation, landowner resistance, and thin administrative capacity hollow out instruments that look powerful on paper—constraints that bite hardest in intermediate cities, understudied relative to the metropolises that supply most of the evidence.</w:t>
-      </w:r>
-    </w:p>
-    <w:p>
-      <w:pPr>
-        <w:spacing w:after="120" w:line="276" w:lineRule="auto"/>
-      </w:pPr>
-      <w:r>
-        <w:t>Latin America offers both the template and the cautionary tale. Bogotá has financed major road and public-space programmes through betterment contributions (contribución de valorización); São Paulo auctions additional building rights as tradable certificates (CEPACs); and Brazil’s 2001 City Statute codified a broad menu now emulated across the region. Yet implementation is uneven: Smolka (2013) documents a persistent gap between legal authorisation and effective deployment, rooted in weak valuation, landowner resistance, and limited administrative capacity. These constraints are sharpest in intermediate cities, which combine fast peri-urban growth with thin technical staff—precisely the cities the evidence base neglects. Luján de Cuyo is therefore not a scaled-down metropolis but a distinct, and more representative, setting.</w:t>
+        <w:t>Land value capture recovers for the public some of the land-value increment created by public investment, regulation, or growth. Latin America has experimented with it for a century—Colombia’s contribución de valorización, São Paulo’s auctioned building-rights certificates (CEPACs), and the broad menu codified by Brazil’s 2001 City Statute—and the toolkit is now well catalogued (Smolka, 2013; OECD &amp; Lincoln Institute, 2022). The recurring lesson is that the binding gap is execution, not legal authorisation: weak valuation, landowner resistance, and thin administrative capacity hollow out instruments that look powerful on paper. These constraints are sharpest in intermediate cities, which pair fast peri-urban growth with thin technical staff and which the evidence base, drawn mostly from metropolises, largely overlooks. Luján de Cuyo is therefore not a scaled-down metropolis but a distinct and understudied setting.</w:t>
       </w:r>
     </w:p>
     <w:p>
@@ -458,7 +450,7 @@
         <w:spacing w:after="120" w:line="276" w:lineRule="auto"/>
       </w:pPr>
       <w:r>
-        <w:t>A single-case design is appropriate because the object of study is an institutional configuration—six instruments, a trust fund, and an allocation index—observed as it is assembled; the aim is analytical generalisation to comparable water-stressed intermediate cities, not statistical inference. We triangulate across document types (ordinances, tax rolls, works programmes, valuation maps, and the index methodology) and, where a figure is realized, cross-check ordinance text against collection records. The central methodological discipline is to keep realized revenue and ex ante potential in separate columns and never to let the second borrow the credibility of the first.</w:t>
+        <w:t>The aim is analytical generalisation to comparable water-stressed intermediate cities, not statistical inference. We triangulate across document types—ordinances, tax rolls, works programmes, valuation maps, and the index methodology—and cross-check ordinance text against collection records wherever a figure is realized. The central discipline is to keep realized revenue and ex ante potential in separate columns and never let the second borrow the credibility of the first.</w:t>
       </w:r>
     </w:p>
     <w:p>
@@ -1791,15 +1783,7 @@
         <w:spacing w:after="120" w:line="276" w:lineRule="auto"/>
       </w:pPr>
       <w:r>
-        <w:t>The eleven-fold rise is not an accounting artefact: it survives deflation by the consumer-price index and conversion at the official exchange rate, so it reflects real growth in the charge’s purchasing power, not merely peso inflation. Three forces drive it—sustained development pressure on the irrigated periphery, an instrument base indexed to keep pace with prices, and steady improvement in billing and collection. The lesson for other cities is that a land-linked charge, properly indexed and administered, can become a material revenue line within a single mandate, even amid extreme macroeconomic volatility; the framework’s feasibility is demonstrated, not merely projected.</w:t>
-      </w:r>
-    </w:p>
-    <w:p>
-      <w:pPr>
-        <w:spacing w:after="120" w:line="276" w:lineRule="auto"/>
-      </w:pPr>
-      <w:r>
-        <w:t>Two robustness notes are warranted. First, the series is reported both in constant 2025 pesos and in US dollars at the official exchange rate; valued at the parallel rate the dollar levels would be lower, but the real growth—measured in pesos before conversion—would be similar, so the elevenfold rise reflects purchasing power rather than an exchange-rate artefact. Second, the increase is quantity as well as price: the charge’s unit base is indexed, but the number of chargeable connections rose with the development pressure documented above, so the trend is not a mere tariff revaluation. The point is not the exact multiple but the direction and durability: a land-linked own-source charge grew in real terms through extreme macroeconomic turbulence.</w:t>
+        <w:t>The eleven-fold rise is real, not an accounting artefact. It survives deflation by the consumer-price index, and because it is measured in pesos before conversion it does not hinge on the exchange rate (at the parallel rate the dollar levels would be lower but the real growth similar). It is quantity as well as price: the charge’s base is indexed, but the number of chargeable connections rose with development pressure, so the trend is not a mere tariff revaluation. Three forces combine—development pressure on the irrigated periphery, an indexed base, and better billing and collection. The point is not the exact multiple but its direction and durability: a land-linked own-source charge grew in real terms through extreme macroeconomic turbulence, so the framework’s feasibility is demonstrated, not merely projected.</w:t>
       </w:r>
     </w:p>
     <w:p>
@@ -4574,7 +4558,7 @@
         <w:spacing w:after="120" w:line="276" w:lineRule="auto"/>
       </w:pPr>
       <w:r>
-        <w:t>Because climate finance can deepen inequity, incidence is a design variable here, not an afterthought. On the paying side, the instruments fall on the owners who capture the windfall: rezoning-gain capture and development-rights sales are paid by those who profit from intensification, and the vacant-land surcharge falls on owners holding serviced land idle—progressive bases, since landownership and development gains are concentrated. On the receiving side, the priority index binds disbursement to need, steering investment toward districts with lower baseline access to green space, water, and services. The combination is deliberately redistributive: value is captured where it is created—the consolidated, high-value, transit-served districts—and spent where deficits are deepest. A framework that merely raised revenue could still be regressive; this one is engineered not to be. And because the index carries an equity-and-community dimension—overcrowding and material deprivation—alongside the green-space dimension computed so far, the disbursement rule is built to favour the most deprived districts, not only the greenest-deficient, extending the redistributive logic as the remaining dimensions come online. Where the final incidence falls depends on local supply elasticities: where developable land is inelastic, as binding water limits make it here, the charge rests on the landowner rather than the buyer, which is precisely the progressive case.</w:t>
+        <w:t>Because climate finance can deepen inequity, incidence is a design variable here, not an afterthought. On the paying side, the instruments fall on the owners who capture the windfall: rezoning-gain capture and development-rights sales are paid by those who profit from intensification, and the vacant-land surcharge falls on owners holding serviced land idle—progressive bases, since landownership and development gains are concentrated. On the receiving side, the priority index binds disbursement to need, steering investment toward districts with lower baseline access to green space, water, and services. The combination is deliberately redistributive: value is captured where it is created—the consolidated, high-value, transit-served districts—and spent where deficits are deepest. A framework that merely raised revenue could still be regressive; this one is engineered not to be. And because the index carries an equity-and-community dimension—overcrowding and material deprivation—alongside the green-space dimension computed so far, the disbursement rule is built to favour the most deprived districts, not only the greenest-deficient, extending the redistributive logic as the remaining dimensions come online.</w:t>
       </w:r>
     </w:p>
     <w:p>
@@ -4582,7 +4566,7 @@
         <w:spacing w:after="120" w:line="276" w:lineRule="auto"/>
       </w:pPr>
       <w:r>
-        <w:t>Two caveats keep the incidence claim honest. First, betterment and development charges can be partly shifted into house prices; the progressivity we claim is of the statutory base, and net incidence depends on local supply elasticities, which the city should monitor as the market responds. Second, an idle-land surcharge can press on asset-rich but cash-poor owners—elderly smallholders on the urban edge, for instance—so the ordinance’s instalment options and hardship provisions are part of the equity design, not administrative afterthoughts. Equity lives in the detail of who is charged and how, as much as in where the money is spent.</w:t>
+        <w:t>Two caveats keep the incidence claim honest. First, betterment and development charges can be partly shifted into house prices; the progressivity we claim is of the statutory base, and where final incidence falls depends on local supply elasticities—where developable land is inelastic, as binding water limits make it here, it rests on the landowner, the progressive case, which the city should nonetheless monitor as the market responds. Second, an idle-land surcharge can press on asset-rich but cash-poor owners—elderly smallholders on the urban edge, for instance—so the ordinance’s instalment options and hardship provisions are part of the equity design, not administrative afterthoughts. Equity lives in the detail of who is charged and how, as much as in where the money is spent.</w:t>
       </w:r>
     </w:p>
     <w:p>
@@ -5399,7 +5383,7 @@
         <w:spacing w:after="120" w:line="276" w:lineRule="auto"/>
       </w:pPr>
       <w:r>
-        <w:t>The exercise above exposes the framework’s central tension and its resolution. Value capture is generated where land is most valuable—the consolidated, transit-served districts that are also the densification zones—yet several of those districts score poorly on green space, and the equity dimension will likely flag the poorer periphery as most deprived. A city that spent each instrument’s proceeds where they arose would entrench that gap; the trust fund, paired with the index, is what prevents it, capturing value where it is created and redirecting it to where need is greatest. This does double duty: it satisfies the financier’s demand for evidence-based prioritisation and disciplines the regressive instinct to invest only where revenue is raised.</w:t>
+        <w:t>The exercise exposes the framework’s central tension and its resolution. Value capture is generated where land is most valuable—the consolidated, transit-served districts that are also the densification zones—yet several of those districts score poorly on green space, and the equity dimension will likely flag the poorer periphery as most deprived. A city that spent each instrument’s proceeds where they arose would entrench that gap; the trust fund, paired with the index, prevents it, capturing value where it is created and redirecting it to where need is greatest. In doing so the case joins three literatures usually kept apart: it extends land value capture from infrastructure cost-recovery into climate adaptation, answers the bankability diagnosis with a concrete revenue mechanism, and moves the empirical centre of gravity from coastal flooding to slow-onset water scarcity, where the capitalisation logic is, if anything, stronger.</w:t>
       </w:r>
     </w:p>
     <w:p>
@@ -5407,23 +5391,7 @@
         <w:spacing w:after="120" w:line="276" w:lineRule="auto"/>
       </w:pPr>
       <w:r>
-        <w:t>These results speak to three literatures at once. For land value capture, they extend instruments designed for transit-oriented development and infrastructure cost recovery into climate adaptation, and document them in an intermediate rather than a metropolitan setting. For climate-adaptation finance, they answer the bankability diagnosis with a concrete revenue mechanism and show how a trust fund converts own-source revenue into counterpart funding and repayment capacity. For the water-and-cities literature, they move the empirical centre of gravity from coastal flooding toward slow-onset water scarcity, where the capitalisation logic—binding hydrological limits on developable land—is, if anything, stronger. The contribution is to join these threads in a single, operating case rather than to advance any one in isolation.</w:t>
-      </w:r>
-    </w:p>
-    <w:p>
-      <w:pPr>
-        <w:spacing w:after="120" w:line="276" w:lineRule="auto"/>
-      </w:pPr>
-      <w:r>
-        <w:t>The framework is built to travel. It is modular—a city can start with the two instruments easiest to administer and add the rest as capacity grows; adaptable—the index reweights to different hazards; and leverage-ready wherever international finance asks for own-source matching and repayment. Its hardest barrier is political economy: LVC moves wealth from landowners to the community and provokes resistance. The workable response, evident in Luján de Cuyo, is to frame the instruments as climate-adaptation finance rather than taxation and to let the earmarking and transparency of the trust fund do the persuading—when residents see a rezoning charge become a plaza or a recharged aquifer in their own district, the politics shift. For financiers, an instrument that manufactures counterpart funds, repayment capacity, and spatial evidence in one structure is the municipal counterpart that turns a thin pipeline thick. The template is most directly relevant to the world’s intermediate cities in semi-arid, water-stressed regions—numerous across Latin America, the Mediterranean, the Middle East, South Asia, and the western United States—where the same development pressure that drives adaptation costs also generates the land value that can pay for them; networks such as C40 and ICLEI are natural channels for its diffusion.</w:t>
-      </w:r>
-    </w:p>
-    <w:p>
-      <w:pPr>
-        <w:spacing w:after="120" w:line="276" w:lineRule="auto"/>
-      </w:pPr>
-      <w:r>
-        <w:t>Two conditions make the model portable, and both are within reach. The first is legal authority to levy the instruments and to earmark their proceeds—available here through municipal competence over zoning and local charges, though it varies across jurisdictions and should be secured before instruments are designed. The second is land-market data, and the requirement is modest: a GIS-based valuation system with land-, built-, and assessment-value layers, the tax roll, an itemised works programme, a buildability code, and district indicators computed one dimension at a time. The Luján de Cuyo experience is that a city can begin before the dataset is complete—two instruments are already collecting while several index dimensions are still being assembled—so partial data is no excuse to wait.</w:t>
+        <w:t>The framework is built to travel. It is modular—a city can start with the two instruments easiest to administer and add the rest as capacity grows; adaptable—the index reweights to different hazards; and leverage-ready wherever international finance asks for own-source matching and repayment. Two enabling conditions are within reach: legal authority to levy and earmark (here, municipal competence over zoning and local charges), and a modest data base—a GIS valuation system, a tax roll, a works programme, and district indicators computed one dimension at a time; Luján de Cuyo began collecting before its dataset was complete. The hardest barrier is political economy: land value capture moves wealth from landowners to the community and provokes resistance, and the workable response is to frame the instruments as adaptation finance rather than taxation and let the earmarking and transparency of the trust fund persuade—when residents see a rezoning charge become a plaza or a recharged aquifer in their own district, the politics shift. For financiers, an instrument that manufactures counterpart funds, repayment capacity, and spatial evidence in one structure turns a thin pipeline thick; the template is most relevant to intermediate cities in semi-arid, water-stressed regions, with networks such as C40 and ICLEI as natural channels for diffusion.</w:t>
       </w:r>
     </w:p>
     <w:p>

</xml_diff>